<commit_message>
Docs: detailed KX3 manual in the FT-817 manual's layout
- Same chapters and look as the FT-817 manual: preparation (PL2303
  driver), connection with a Settings screenshot, profiles, window
  layout, LCD reference, every key (tap / hold), knob functions and
  ranges, frequency / mode / VFO / split / RIT-XIT / transmit / CW /
  power off / refresh, KX2, exit, sharing the port, troubleshooting.
- Screenshots: window with title bar and LCD close-up from a real KX3,
  Settings with Elecraft selected, and a TX / RIT example taken with a
  simulated radio (marked as such).
- Documents current limits: keypad digits 7/8/9/0 cannot be entered
  from the window (XMIT transmits), DATA sub mode and the menu are
  operated on the radio.
- PDF headings and Word styles follow the FT-817 manual.

Co-Authored-By: Claude Opus 5.5 <noreply@anthropic.com>
</commit_message>
<xml_diff>
--- a/docs/KX3_操作説明書.docx
+++ b/docs/KX3_操作説明書.docx
@@ -38,7 +38,7 @@
         <w:pStyle w:val="ListBullet"/>
       </w:pPr>
       <w:r>
-        <w:t>本体前面の 22 個のキーと、押せるつまみ 4 個の操作（短く押す・長押しの両方）</w:t>
+        <w:t>本体前面の 22 個のキーと、つまみの押しボタン 4 個の操作（短く押す・長押しの両方）</w:t>
       </w:r>
     </w:p>
     <w:p>
@@ -46,7 +46,23 @@
         <w:pStyle w:val="ListBullet"/>
       </w:pPr>
       <w:r>
-        <w:t>周波数の変更（VFO A ダイヤル、周波数の桁クリック、周波数入力欄、OFS/B つまみで VFO B）</w:t>
+        <w:t>周波数の変更（VFO A ダイヤル、周波数の桁クリック、周波数入力欄、BAND+ / BAND−、OFS/B つまみで VFO B）</w:t>
+      </w:r>
+    </w:p>
+    <w:p>
+      <w:pPr>
+        <w:pStyle w:val="ListBullet"/>
+      </w:pPr>
+      <w:r>
+        <w:t>モードの切り替え（LSB / USB / CW / CW-R / AM / FM / DATA / DATA-R）</w:t>
+      </w:r>
+    </w:p>
+    <w:p>
+      <w:pPr>
+        <w:pStyle w:val="ListBullet"/>
+      </w:pPr>
+      <w:r>
+        <w:t>VFO A / B の入れ替え・コピー、スプリット、RIT / XIT とオフセット</w:t>
       </w:r>
     </w:p>
     <w:p>
@@ -55,14 +71,6 @@
       </w:pPr>
       <w:r>
         <w:t>AF ゲイン、RF ゲイン、スケルチ、帯域幅、シフト、マイクゲイン、キーヤー速度、送信出力の調整</w:t>
-      </w:r>
-    </w:p>
-    <w:p>
-      <w:pPr>
-        <w:pStyle w:val="ListBullet"/>
-      </w:pPr>
-      <w:r>
-        <w:t>RIT / XIT とオフセットの調整</w:t>
       </w:r>
     </w:p>
     <w:p>
@@ -86,7 +94,7 @@
         <w:pStyle w:val="ListBullet"/>
       </w:pPr>
       <w:r>
-        <w:t>S メーター、送信時の出力、各種表示（PRE、ATT、NB、VOX、LOCK、AGC など）</w:t>
+        <w:t>S メーター、送信時の出力、各種表示（PRE、ATT、NB、VOX、LOCK、AGC、NR、APF など）の表示</w:t>
       </w:r>
     </w:p>
     <w:p>
@@ -101,7 +109,7 @@
       <w:r>
         <w:drawing>
           <wp:inline xmlns:a="http://schemas.openxmlformats.org/drawingml/2006/main" xmlns:pic="http://schemas.openxmlformats.org/drawingml/2006/picture">
-            <wp:extent cx="6120000" cy="3151800"/>
+            <wp:extent cx="6120000" cy="3300975"/>
             <wp:docPr id="1" name="Picture 1"/>
             <wp:cNvGraphicFramePr>
               <a:graphicFrameLocks noChangeAspect="1"/>
@@ -114,7 +122,7 @@
                     <pic:cNvPicPr/>
                   </pic:nvPicPr>
                   <pic:blipFill>
-                    <a:blip r:embed="rId9"/>
+                    <a:blip r:embed="rId12"/>
                     <a:stretch>
                       <a:fillRect/>
                     </a:stretch>
@@ -122,7 +130,7 @@
                   <pic:spPr>
                     <a:xfrm>
                       <a:off x="0" y="0"/>
-                      <a:ext cx="6120000" cy="3151800"/>
+                      <a:ext cx="6120000" cy="3300975"/>
                     </a:xfrm>
                     <a:prstGeom prst="rect"/>
                   </pic:spPr>
@@ -186,7 +194,22 @@
     </w:p>
     <w:p>
       <w:r>
-        <w:t>純正の KXUSB（FTDI チップ）は、macOS 標準のドライバーで認識されます。Prolific 製チップ（PL2303 系）の互換ケーブルは、ドライバーが必要です。</w:t>
+        <w:t>純正の KXUSB（FTDI チップ）は、macOS 標準のドライバーで認識されます。ケーブルを挿すと、</w:t>
+      </w:r>
+      <w:r>
+        <w:rPr>
+          <w:rFonts w:ascii="Menlo" w:hAnsi="Menlo"/>
+          <w:sz w:val="18"/>
+        </w:rPr>
+        <w:t>/dev/cu.usbserial-…</w:t>
+      </w:r>
+      <w:r>
+        <w:t xml:space="preserve"> という名前のシリアルポートが現れます。</w:t>
+      </w:r>
+    </w:p>
+    <w:p>
+      <w:r>
+        <w:t>Prolific 製チップ（PL2303 系）の互換ケーブルは、ドライバーが必要です。</w:t>
       </w:r>
     </w:p>
     <w:p>
@@ -219,7 +242,7 @@
         <w:pStyle w:val="ListNumber"/>
       </w:pPr>
       <w:r>
-        <w:t>ケーブルを挿し直すと、</w:t>
+        <w:t>ケーブルを Mac から抜いて挿し直します。</w:t>
       </w:r>
       <w:r>
         <w:rPr>
@@ -260,7 +283,7 @@
         <w:pStyle w:val="ListNumber"/>
       </w:pPr>
       <w:r>
-        <w:t>ケーブルを KX3 の ACC1 端子に挿します。</w:t>
+        <w:t>ケーブルを KX3 の ACC1 端子（3.5mm ステレオジャック）に挿します。</w:t>
       </w:r>
     </w:p>
     <w:p>
@@ -282,6 +305,14 @@
     </w:p>
     <w:p>
       <w:pPr>
+        <w:pStyle w:val="ListNumber"/>
+      </w:pPr>
+      <w:r>
+        <w:t>通常は他の CAT 関連の設定を変える必要はありません。</w:t>
+      </w:r>
+    </w:p>
+    <w:p>
+      <w:pPr>
         <w:pStyle w:val="Heading1"/>
       </w:pPr>
       <w:r>
@@ -293,12 +324,75 @@
         <w:pStyle w:val="Heading2"/>
       </w:pPr>
       <w:r>
-        <w:t>3.1 接続の設定</w:t>
+        <w:t>3.1 起動すると設定画面が開きます</w:t>
       </w:r>
     </w:p>
     <w:p>
       <w:r>
-        <w:t>wfview-mac を起動すると、最初は設定画面だけが開きます。左のリストで「無線機との接続方法」を選び、次のように設定します。</w:t>
+        <w:t>wfview-mac を起動すると、最初は設定画面だけが開きます。起動しただけでは無線機に接続しません。</w:t>
+      </w:r>
+    </w:p>
+    <w:p>
+      <w:pPr>
+        <w:jc w:val="center"/>
+      </w:pPr>
+      <w:r>
+        <w:drawing>
+          <wp:inline xmlns:a="http://schemas.openxmlformats.org/drawingml/2006/main" xmlns:pic="http://schemas.openxmlformats.org/drawingml/2006/picture">
+            <wp:extent cx="6120000" cy="3710250"/>
+            <wp:docPr id="2" name="Picture 2"/>
+            <wp:cNvGraphicFramePr>
+              <a:graphicFrameLocks noChangeAspect="1"/>
+            </wp:cNvGraphicFramePr>
+            <a:graphic>
+              <a:graphicData uri="http://schemas.openxmlformats.org/drawingml/2006/picture">
+                <pic:pic>
+                  <pic:nvPicPr>
+                    <pic:cNvPr id="0" name="settings-kx3.png"/>
+                    <pic:cNvPicPr/>
+                  </pic:nvPicPr>
+                  <pic:blipFill>
+                    <a:blip r:embed="rId13"/>
+                    <a:stretch>
+                      <a:fillRect/>
+                    </a:stretch>
+                  </pic:blipFill>
+                  <pic:spPr>
+                    <a:xfrm>
+                      <a:off x="0" y="0"/>
+                      <a:ext cx="6120000" cy="3710250"/>
+                    </a:xfrm>
+                    <a:prstGeom prst="rect"/>
+                  </pic:spPr>
+                </pic:pic>
+              </a:graphicData>
+            </a:graphic>
+          </wp:inline>
+        </w:drawing>
+      </w:r>
+    </w:p>
+    <w:p>
+      <w:pPr>
+        <w:jc w:val="center"/>
+      </w:pPr>
+      <w:r>
+        <w:rPr>
+          <w:sz w:val="18"/>
+        </w:rPr>
+        <w:t>設定画面（KX3 の接続設定）</w:t>
+      </w:r>
+    </w:p>
+    <w:p>
+      <w:pPr>
+        <w:pStyle w:val="Heading2"/>
+      </w:pPr>
+      <w:r>
+        <w:t>3.2 接続の設定</w:t>
+      </w:r>
+    </w:p>
+    <w:p>
+      <w:r>
+        <w:t>設定画面の左のリストで「無線機との接続方法」を選び、次のように設定します。</w:t>
       </w:r>
     </w:p>
     <w:tbl>
@@ -516,8 +610,97 @@
           </w:p>
         </w:tc>
       </w:tr>
+      <w:tr>
+        <w:tc>
+          <w:tcPr>
+            <w:tcW w:type="dxa" w:w="4819"/>
+          </w:tcPr>
+          <w:p>
+            <w:r>
+              <w:rPr>
+                <w:sz w:val="19"/>
+              </w:rPr>
+              <w:t>PTT Type</w:t>
+            </w:r>
+          </w:p>
+        </w:tc>
+        <w:tc>
+          <w:tcPr>
+            <w:tcW w:type="dxa" w:w="4819"/>
+          </w:tcPr>
+          <w:p>
+            <w:r>
+              <w:rPr>
+                <w:sz w:val="19"/>
+              </w:rPr>
+              <w:t>そのままでかまいません（KX3 画面では CAT コマンドで送信します）</w:t>
+            </w:r>
+          </w:p>
+        </w:tc>
+      </w:tr>
     </w:tbl>
     <w:p/>
+    <w:p>
+      <w:pPr>
+        <w:pStyle w:val="ListBullet"/>
+      </w:pPr>
+      <w:r>
+        <w:t xml:space="preserve">機種の欄の候補は、メーカーを </w:t>
+      </w:r>
+      <w:r>
+        <w:rPr>
+          <w:rFonts w:ascii="Menlo" w:hAnsi="Menlo"/>
+          <w:sz w:val="18"/>
+        </w:rPr>
+        <w:t>Elecraft</w:t>
+      </w:r>
+      <w:r>
+        <w:t xml:space="preserve"> にすると </w:t>
+      </w:r>
+      <w:r>
+        <w:rPr>
+          <w:rFonts w:ascii="Menlo" w:hAnsi="Menlo"/>
+          <w:sz w:val="18"/>
+        </w:rPr>
+        <w:t>KX3 / KX2 (USB serial CAT)</w:t>
+      </w:r>
+      <w:r>
+        <w:t xml:space="preserve"> だけになります。</w:t>
+      </w:r>
+    </w:p>
+    <w:p>
+      <w:pPr>
+        <w:pStyle w:val="ListBullet"/>
+      </w:pPr>
+      <w:r>
+        <w:rPr>
+          <w:rFonts w:ascii="Menlo" w:hAnsi="Menlo"/>
+          <w:sz w:val="18"/>
+        </w:rPr>
+        <w:t>ネットワーク接続</w:t>
+      </w:r>
+      <w:r>
+        <w:t xml:space="preserve"> には対応していません。必ず </w:t>
+      </w:r>
+      <w:r>
+        <w:rPr>
+          <w:rFonts w:ascii="Menlo" w:hAnsi="Menlo"/>
+          <w:sz w:val="18"/>
+        </w:rPr>
+        <w:t>シリアルポート接続</w:t>
+      </w:r>
+      <w:r>
+        <w:t xml:space="preserve"> を選びます。</w:t>
+      </w:r>
+    </w:p>
+    <w:p>
+      <w:pPr>
+        <w:pStyle w:val="Heading2"/>
+      </w:pPr>
+      <w:r>
+        <w:t>3.3 接続プロファイルに保存する</w:t>
+      </w:r>
+    </w:p>
     <w:p>
       <w:r>
         <w:rPr>
@@ -547,7 +730,51 @@
         <w:t>保存</w:t>
       </w:r>
       <w:r>
-        <w:t xml:space="preserve"> を押すと、上の設定を保存できます。次回からは一覧で選ぶだけで読み込まれます。</w:t>
+        <w:t xml:space="preserve"> を押すと、上の設定を名前を付けて保存できます。次回からは一覧で選ぶだけで設定が読み込まれます。</w:t>
+      </w:r>
+    </w:p>
+    <w:p>
+      <w:pPr>
+        <w:pStyle w:val="ListBullet"/>
+      </w:pPr>
+      <w:r>
+        <w:t>設定画面を開くたびに、選択中のプロファイルの内容が読み込まれます（無線機に接続中は読み込みません）。</w:t>
+      </w:r>
+    </w:p>
+    <w:p>
+      <w:pPr>
+        <w:pStyle w:val="ListBullet"/>
+      </w:pPr>
+      <w:r>
+        <w:t xml:space="preserve">不要になったプロファイルは、選んで </w:t>
+      </w:r>
+      <w:r>
+        <w:rPr>
+          <w:rFonts w:ascii="Menlo" w:hAnsi="Menlo"/>
+          <w:sz w:val="18"/>
+        </w:rPr>
+        <w:t>削除</w:t>
+      </w:r>
+      <w:r>
+        <w:t xml:space="preserve"> を押します。</w:t>
+      </w:r>
+    </w:p>
+    <w:p>
+      <w:pPr>
+        <w:pStyle w:val="ListBullet"/>
+      </w:pPr>
+      <w:r>
+        <w:t xml:space="preserve">画面下の </w:t>
+      </w:r>
+      <w:r>
+        <w:rPr>
+          <w:rFonts w:ascii="Menlo" w:hAnsi="Menlo"/>
+          <w:sz w:val="18"/>
+        </w:rPr>
+        <w:t>設定を保存</w:t>
+      </w:r>
+      <w:r>
+        <w:t xml:space="preserve"> を押すと、その他の設定も含めて保存されます。</w:t>
       </w:r>
     </w:p>
     <w:p>
@@ -555,7 +782,7 @@
         <w:pStyle w:val="Heading2"/>
       </w:pPr>
       <w:r>
-        <w:t>3.2 無線機に接続する</w:t>
+        <w:t>3.4 無線機に接続する</w:t>
       </w:r>
     </w:p>
     <w:p>
@@ -604,7 +831,17 @@
         <w:t>wfview - KX3 (/dev/cu.PL2303G-USBtoUART10 @ 38400 bps)</w:t>
       </w:r>
       <w:r>
-        <w:t>）。</w:t>
+        <w:t xml:space="preserve">）。KX2 を接続した場合は、自動で KX2 と判別し、タイトルと画面右上の表示が </w:t>
+      </w:r>
+      <w:r>
+        <w:rPr>
+          <w:rFonts w:ascii="Menlo" w:hAnsi="Menlo"/>
+          <w:sz w:val="18"/>
+        </w:rPr>
+        <w:t>KX2</w:t>
+      </w:r>
+      <w:r>
+        <w:t xml:space="preserve"> になります。</w:t>
       </w:r>
     </w:p>
     <w:p>
@@ -615,7 +852,7 @@
         <w:rPr>
           <w:color w:val="0645AD"/>
         </w:rPr>
-        <w:t>8. トラブルシューティング</w:t>
+        <w:t>9. トラブルシューティング</w:t>
       </w:r>
       <w:r>
         <w:t xml:space="preserve"> を見てください。</w:t>
@@ -626,7 +863,7 @@
         <w:pStyle w:val="Heading2"/>
       </w:pPr>
       <w:r>
-        <w:t>3.3 切断して設定画面に戻る</w:t>
+        <w:t>3.5 切断して設定画面に戻る</w:t>
       </w:r>
     </w:p>
     <w:p>
@@ -641,12 +878,27 @@
         <w:t>切断して戻る</w:t>
       </w:r>
       <w:r>
-        <w:t xml:space="preserve"> を押すと、無線機から切断して設定画面に戻ります。ウインドウの閉じるボタンで閉じた場合も、送信中なら受信に戻してからシリアルポートを閉じます。</w:t>
+        <w:t xml:space="preserve"> を押すと、無線機から切断して KX3 画面を閉じ、設定画面に戻ります。設定を変えて、もう一度 </w:t>
+      </w:r>
+      <w:r>
+        <w:rPr>
+          <w:rFonts w:ascii="Menlo" w:hAnsi="Menlo"/>
+          <w:sz w:val="18"/>
+        </w:rPr>
+        <w:t>無線機に接続</w:t>
+      </w:r>
+      <w:r>
+        <w:t xml:space="preserve"> で接続し直せます。</w:t>
       </w:r>
     </w:p>
     <w:p>
       <w:r>
-        <w:t>接続中、送信出力を 0.1 W 単位で読み書きするため、本体の CAT 設定（K2 拡張モード）を一時的に変えます。切断するときに元の設定に戻します。</w:t>
+        <w:t>KX3 画面をウインドウの閉じるボタンで閉じた場合も、送信中なら受信に戻してからシリアルポートを閉じます。</w:t>
+      </w:r>
+    </w:p>
+    <w:p>
+      <w:r>
+        <w:t>接続中は、送信出力を 0.1 W 単位で読み書きするため、本体の CAT の設定（K2 拡張モード）を一時的に変えます。切断するときに、接続前の設定に戻します。</w:t>
       </w:r>
     </w:p>
     <w:p>
@@ -667,7 +919,7 @@
     </w:p>
     <w:p>
       <w:r>
-        <w:t>本体と同じ配置です。キーの上の黄色い小さな文字は、長押ししたときの機能です。</w:t>
+        <w:t>キーとつまみは本体と同じ配置です。キーの上の黄色い小さな文字は、そのキーを長押ししたときの機能です。</w:t>
       </w:r>
     </w:p>
     <w:tbl>
@@ -720,7 +972,7 @@
               <w:rPr>
                 <w:sz w:val="19"/>
               </w:rPr>
-              <w:t>LCD の左</w:t>
+              <w:t>左上</w:t>
             </w:r>
           </w:p>
         </w:tc>
@@ -949,7 +1201,7 @@
               <w:rPr>
                 <w:sz w:val="19"/>
               </w:rPr>
-              <w:t>つまみ AF/RF-SQL・PBT I/II・KEYER/MIC と、その押しボタン</w:t>
+              <w:t>小さなつまみ 3 個（AF / RF-SQL、PBT I/II、KEYER / MIC）と、それぞれの押しボタン</w:t>
             </w:r>
           </w:p>
         </w:tc>
@@ -1023,6 +1275,19 @@
               <w:rPr>
                 <w:sz w:val="19"/>
               </w:rPr>
+              <w:t>（左の列）、</w:t>
+            </w:r>
+            <w:r>
+              <w:rPr>
+                <w:rFonts w:ascii="Menlo" w:hAnsi="Menlo"/>
+                <w:sz w:val="19"/>
+              </w:rPr>
+              <w:t>A / B</w:t>
+            </w:r>
+            <w:r>
+              <w:rPr>
+                <w:sz w:val="19"/>
+              </w:rPr>
               <w:t xml:space="preserve"> </w:t>
             </w:r>
             <w:r>
@@ -1030,7 +1295,7 @@
                 <w:rFonts w:ascii="Menlo" w:hAnsi="Menlo"/>
                 <w:sz w:val="19"/>
               </w:rPr>
-              <w:t>A / B</w:t>
+              <w:t>A → B</w:t>
             </w:r>
             <w:r>
               <w:rPr>
@@ -1043,7 +1308,7 @@
                 <w:rFonts w:ascii="Menlo" w:hAnsi="Menlo"/>
                 <w:sz w:val="19"/>
               </w:rPr>
-              <w:t>A → B</w:t>
+              <w:t>XIT</w:t>
             </w:r>
             <w:r>
               <w:rPr>
@@ -1056,20 +1321,13 @@
                 <w:rFonts w:ascii="Menlo" w:hAnsi="Menlo"/>
                 <w:sz w:val="19"/>
               </w:rPr>
-              <w:t>XIT</w:t>
-            </w:r>
-            <w:r>
-              <w:rPr>
-                <w:sz w:val="19"/>
-              </w:rPr>
-              <w:t xml:space="preserve"> </w:t>
-            </w:r>
-            <w:r>
-              <w:rPr>
-                <w:rFonts w:ascii="Menlo" w:hAnsi="Menlo"/>
-                <w:sz w:val="19"/>
-              </w:rPr>
               <w:t>DISP</w:t>
+            </w:r>
+            <w:r>
+              <w:rPr>
+                <w:sz w:val="19"/>
+              </w:rPr>
+              <w:t>（右の列）</w:t>
             </w:r>
           </w:p>
         </w:tc>
@@ -1097,7 +1355,7 @@
               <w:rPr>
                 <w:sz w:val="19"/>
               </w:rPr>
-              <w:t>OFS/B つまみと押しボタン、VFO A ダイヤル</w:t>
+              <w:t>OFS / B つまみと押しボタン、VFO A ダイヤル</w:t>
             </w:r>
           </w:p>
         </w:tc>
@@ -1178,6 +1436,56 @@
       </w:pPr>
       <w:r>
         <w:t>4.2 LCD の表示</w:t>
+      </w:r>
+    </w:p>
+    <w:p>
+      <w:pPr>
+        <w:jc w:val="center"/>
+      </w:pPr>
+      <w:r>
+        <w:drawing>
+          <wp:inline xmlns:a="http://schemas.openxmlformats.org/drawingml/2006/main" xmlns:pic="http://schemas.openxmlformats.org/drawingml/2006/picture">
+            <wp:extent cx="6120000" cy="2854145"/>
+            <wp:docPr id="3" name="Picture 3"/>
+            <wp:cNvGraphicFramePr>
+              <a:graphicFrameLocks noChangeAspect="1"/>
+            </wp:cNvGraphicFramePr>
+            <a:graphic>
+              <a:graphicData uri="http://schemas.openxmlformats.org/drawingml/2006/picture">
+                <pic:pic>
+                  <pic:nvPicPr>
+                    <pic:cNvPr id="0" name="kx3-lcd.png"/>
+                    <pic:cNvPicPr/>
+                  </pic:nvPicPr>
+                  <pic:blipFill>
+                    <a:blip r:embed="rId14"/>
+                    <a:stretch>
+                      <a:fillRect/>
+                    </a:stretch>
+                  </pic:blipFill>
+                  <pic:spPr>
+                    <a:xfrm>
+                      <a:off x="0" y="0"/>
+                      <a:ext cx="6120000" cy="2854145"/>
+                    </a:xfrm>
+                    <a:prstGeom prst="rect"/>
+                  </pic:spPr>
+                </pic:pic>
+              </a:graphicData>
+            </a:graphic>
+          </wp:inline>
+        </w:drawing>
+      </w:r>
+    </w:p>
+    <w:p>
+      <w:pPr>
+        <w:jc w:val="center"/>
+      </w:pPr>
+      <w:r>
+        <w:rPr>
+          <w:sz w:val="18"/>
+        </w:rPr>
+        <w:t>LCD の表示（実機 KX3、15m バンド USB の受信中）</w:t>
       </w:r>
     </w:p>
     <w:tbl>
@@ -1230,7 +1538,20 @@
               <w:rPr>
                 <w:sz w:val="19"/>
               </w:rPr>
-              <w:t>最上段のバー</w:t>
+              <w:t>最上段のバー（</w:t>
+            </w:r>
+            <w:r>
+              <w:rPr>
+                <w:rFonts w:ascii="Menlo" w:hAnsi="Menlo"/>
+                <w:sz w:val="19"/>
+              </w:rPr>
+              <w:t>S</w:t>
+            </w:r>
+            <w:r>
+              <w:rPr>
+                <w:sz w:val="19"/>
+              </w:rPr>
+              <w:t>）</w:t>
             </w:r>
           </w:p>
         </w:tc>
@@ -1243,20 +1564,33 @@
               <w:rPr>
                 <w:sz w:val="19"/>
               </w:rPr>
-              <w:t>受信中は S メーター（右に S 値）、送信中は出力（</w:t>
+              <w:t xml:space="preserve">受信中は信号の強さを 15 段で表示します。目盛りは S3 / S5 / S7 / S9 / +20 / +40 / +60 です。右に S 値（例: </w:t>
             </w:r>
             <w:r>
               <w:rPr>
                 <w:rFonts w:ascii="Menlo" w:hAnsi="Menlo"/>
                 <w:sz w:val="19"/>
               </w:rPr>
-              <w:t>PWR</w:t>
-            </w:r>
-            <w:r>
-              <w:rPr>
-                <w:sz w:val="19"/>
-              </w:rPr>
-              <w:t>）</w:t>
+              <w:t>S0</w:t>
+            </w:r>
+            <w:r>
+              <w:rPr>
+                <w:sz w:val="19"/>
+              </w:rPr>
+              <w:t>、</w:t>
+            </w:r>
+            <w:r>
+              <w:rPr>
+                <w:rFonts w:ascii="Menlo" w:hAnsi="Menlo"/>
+                <w:sz w:val="19"/>
+              </w:rPr>
+              <w:t>S9+10</w:t>
+            </w:r>
+            <w:r>
+              <w:rPr>
+                <w:sz w:val="19"/>
+              </w:rPr>
+              <w:t>）を表示します</w:t>
             </w:r>
           </w:p>
         </w:tc>
@@ -1269,127 +1603,22 @@
           <w:p>
             <w:r>
               <w:rPr>
+                <w:sz w:val="19"/>
+              </w:rPr>
+              <w:t>最上段のバー（</w:t>
+            </w:r>
+            <w:r>
+              <w:rPr>
                 <w:rFonts w:ascii="Menlo" w:hAnsi="Menlo"/>
                 <w:sz w:val="19"/>
               </w:rPr>
-              <w:t>TX</w:t>
-            </w:r>
-            <w:r>
-              <w:rPr>
-                <w:sz w:val="19"/>
-              </w:rPr>
-              <w:t xml:space="preserve"> </w:t>
-            </w:r>
-            <w:r>
-              <w:rPr>
-                <w:rFonts w:ascii="Menlo" w:hAnsi="Menlo"/>
-                <w:sz w:val="19"/>
-              </w:rPr>
-              <w:t>SPLT</w:t>
-            </w:r>
-            <w:r>
-              <w:rPr>
-                <w:sz w:val="19"/>
-              </w:rPr>
-              <w:t xml:space="preserve"> </w:t>
-            </w:r>
-            <w:r>
-              <w:rPr>
-                <w:rFonts w:ascii="Menlo" w:hAnsi="Menlo"/>
-                <w:sz w:val="19"/>
-              </w:rPr>
-              <w:t>RIT</w:t>
-            </w:r>
-            <w:r>
-              <w:rPr>
-                <w:sz w:val="19"/>
-              </w:rPr>
-              <w:t xml:space="preserve"> </w:t>
-            </w:r>
-            <w:r>
-              <w:rPr>
-                <w:rFonts w:ascii="Menlo" w:hAnsi="Menlo"/>
-                <w:sz w:val="19"/>
-              </w:rPr>
-              <w:t>XIT</w:t>
-            </w:r>
-            <w:r>
-              <w:rPr>
-                <w:sz w:val="19"/>
-              </w:rPr>
-              <w:t xml:space="preserve"> </w:t>
-            </w:r>
-            <w:r>
-              <w:rPr>
-                <w:rFonts w:ascii="Menlo" w:hAnsi="Menlo"/>
-                <w:sz w:val="19"/>
-              </w:rPr>
-              <w:t>PRE</w:t>
-            </w:r>
-            <w:r>
-              <w:rPr>
-                <w:sz w:val="19"/>
-              </w:rPr>
-              <w:t xml:space="preserve"> </w:t>
-            </w:r>
-            <w:r>
-              <w:rPr>
-                <w:rFonts w:ascii="Menlo" w:hAnsi="Menlo"/>
-                <w:sz w:val="19"/>
-              </w:rPr>
-              <w:t>ATT</w:t>
-            </w:r>
-            <w:r>
-              <w:rPr>
-                <w:sz w:val="19"/>
-              </w:rPr>
-              <w:t xml:space="preserve"> </w:t>
-            </w:r>
-            <w:r>
-              <w:rPr>
-                <w:rFonts w:ascii="Menlo" w:hAnsi="Menlo"/>
-                <w:sz w:val="19"/>
-              </w:rPr>
-              <w:t>NB</w:t>
-            </w:r>
-            <w:r>
-              <w:rPr>
-                <w:sz w:val="19"/>
-              </w:rPr>
-              <w:t xml:space="preserve"> </w:t>
-            </w:r>
-            <w:r>
-              <w:rPr>
-                <w:rFonts w:ascii="Menlo" w:hAnsi="Menlo"/>
-                <w:sz w:val="19"/>
-              </w:rPr>
-              <w:t>VOX</w:t>
-            </w:r>
-            <w:r>
-              <w:rPr>
-                <w:sz w:val="19"/>
-              </w:rPr>
-              <w:t xml:space="preserve"> </w:t>
-            </w:r>
-            <w:r>
-              <w:rPr>
-                <w:rFonts w:ascii="Menlo" w:hAnsi="Menlo"/>
-                <w:sz w:val="19"/>
-              </w:rPr>
-              <w:t>LOCK</w:t>
-            </w:r>
-            <w:r>
-              <w:rPr>
-                <w:sz w:val="19"/>
-              </w:rPr>
-              <w:t xml:space="preserve"> </w:t>
-            </w:r>
-            <w:r>
-              <w:rPr>
-                <w:rFonts w:ascii="Menlo" w:hAnsi="Menlo"/>
-                <w:sz w:val="19"/>
-              </w:rPr>
-              <w:t>AGC-F/S</w:t>
+              <w:t>PWR</w:t>
+            </w:r>
+            <w:r>
+              <w:rPr>
+                <w:sz w:val="19"/>
+              </w:rPr>
+              <w:t>）</w:t>
             </w:r>
           </w:p>
         </w:tc>
@@ -1402,7 +1631,20 @@
               <w:rPr>
                 <w:sz w:val="19"/>
               </w:rPr>
-              <w:t>点灯しているものが有効な状態です</w:t>
+              <w:t xml:space="preserve">送信中は出力を 10 段で表示し、右に </w:t>
+            </w:r>
+            <w:r>
+              <w:rPr>
+                <w:rFonts w:ascii="Menlo" w:hAnsi="Menlo"/>
+                <w:sz w:val="19"/>
+              </w:rPr>
+              <w:t>TX</w:t>
+            </w:r>
+            <w:r>
+              <w:rPr>
+                <w:sz w:val="19"/>
+              </w:rPr>
+              <w:t xml:space="preserve"> と表示します</w:t>
             </w:r>
           </w:p>
         </w:tc>
@@ -1415,9 +1657,10 @@
           <w:p>
             <w:r>
               <w:rPr>
-                <w:sz w:val="19"/>
-              </w:rPr>
-              <w:t>周波数（大きな数字）</w:t>
+                <w:rFonts w:ascii="Menlo" w:hAnsi="Menlo"/>
+                <w:sz w:val="19"/>
+              </w:rPr>
+              <w:t>TX</w:t>
             </w:r>
           </w:p>
         </w:tc>
@@ -1430,7 +1673,7 @@
               <w:rPr>
                 <w:sz w:val="19"/>
               </w:rPr>
-              <w:t>VFO A。10 Hz の桁まで表示します。下線の付いた桁が、ダイヤル 1 目盛りの変化量（ステップ）です</w:t>
+              <w:t>送信中</w:t>
             </w:r>
           </w:p>
         </w:tc>
@@ -1443,9 +1686,10 @@
           <w:p>
             <w:r>
               <w:rPr>
-                <w:sz w:val="19"/>
-              </w:rPr>
-              <w:t>モード</w:t>
+                <w:rFonts w:ascii="Menlo" w:hAnsi="Menlo"/>
+                <w:sz w:val="19"/>
+              </w:rPr>
+              <w:t>SPLT</w:t>
             </w:r>
           </w:p>
         </w:tc>
@@ -1458,7 +1702,7 @@
               <w:rPr>
                 <w:sz w:val="19"/>
               </w:rPr>
-              <w:t>LSB / USB / CW / CW-R / AM / FM / DATA / DATA-R。DATA のときはサブモード（DATA A / AFSK A / FSK D / PSK D）も表示します</w:t>
+              <w:t>スプリット（VFO B で送信）が ON</w:t>
             </w:r>
           </w:p>
         </w:tc>
@@ -1474,7 +1718,20 @@
                 <w:rFonts w:ascii="Menlo" w:hAnsi="Menlo"/>
                 <w:sz w:val="19"/>
               </w:rPr>
-              <w:t>RIT ±x.xxk</w:t>
+              <w:t>RIT</w:t>
+            </w:r>
+            <w:r>
+              <w:rPr>
+                <w:sz w:val="19"/>
+              </w:rPr>
+              <w:t xml:space="preserve"> / </w:t>
+            </w:r>
+            <w:r>
+              <w:rPr>
+                <w:rFonts w:ascii="Menlo" w:hAnsi="Menlo"/>
+                <w:sz w:val="19"/>
+              </w:rPr>
+              <w:t>XIT</w:t>
             </w:r>
           </w:p>
         </w:tc>
@@ -1487,7 +1744,7 @@
               <w:rPr>
                 <w:sz w:val="19"/>
               </w:rPr>
-              <w:t>RIT / XIT が ON のときのオフセット</w:t>
+              <w:t>RIT / XIT が ON</w:t>
             </w:r>
           </w:p>
         </w:tc>
@@ -1503,7 +1760,20 @@
                 <w:rFonts w:ascii="Menlo" w:hAnsi="Menlo"/>
                 <w:sz w:val="19"/>
               </w:rPr>
-              <w:t>VFO B</w:t>
+              <w:t>PRE</w:t>
+            </w:r>
+            <w:r>
+              <w:rPr>
+                <w:sz w:val="19"/>
+              </w:rPr>
+              <w:t xml:space="preserve"> / </w:t>
+            </w:r>
+            <w:r>
+              <w:rPr>
+                <w:rFonts w:ascii="Menlo" w:hAnsi="Menlo"/>
+                <w:sz w:val="19"/>
+              </w:rPr>
+              <w:t>ATT</w:t>
             </w:r>
           </w:p>
         </w:tc>
@@ -1516,7 +1786,7 @@
               <w:rPr>
                 <w:sz w:val="19"/>
               </w:rPr>
-              <w:t>VFO B の周波数</w:t>
+              <w:t>プリアンプ / アッテネーターが ON</w:t>
             </w:r>
           </w:p>
         </w:tc>
@@ -1529,22 +1799,36 @@
           <w:p>
             <w:r>
               <w:rPr>
-                <w:sz w:val="19"/>
-              </w:rPr>
-              <w:t xml:space="preserve">バンド（例: </w:t>
-            </w:r>
-            <w:r>
-              <w:rPr>
                 <w:rFonts w:ascii="Menlo" w:hAnsi="Menlo"/>
                 <w:sz w:val="19"/>
               </w:rPr>
-              <w:t>40m</w:t>
-            </w:r>
-            <w:r>
-              <w:rPr>
-                <w:sz w:val="19"/>
-              </w:rPr>
-              <w:t>）</w:t>
+              <w:t>NB</w:t>
+            </w:r>
+            <w:r>
+              <w:rPr>
+                <w:sz w:val="19"/>
+              </w:rPr>
+              <w:t xml:space="preserve"> / </w:t>
+            </w:r>
+            <w:r>
+              <w:rPr>
+                <w:rFonts w:ascii="Menlo" w:hAnsi="Menlo"/>
+                <w:sz w:val="19"/>
+              </w:rPr>
+              <w:t>VOX</w:t>
+            </w:r>
+            <w:r>
+              <w:rPr>
+                <w:sz w:val="19"/>
+              </w:rPr>
+              <w:t xml:space="preserve"> / </w:t>
+            </w:r>
+            <w:r>
+              <w:rPr>
+                <w:rFonts w:ascii="Menlo" w:hAnsi="Menlo"/>
+                <w:sz w:val="19"/>
+              </w:rPr>
+              <w:t>LOCK</w:t>
             </w:r>
           </w:p>
         </w:tc>
@@ -1557,7 +1841,7 @@
               <w:rPr>
                 <w:sz w:val="19"/>
               </w:rPr>
-              <w:t>現在のバンド</w:t>
+              <w:t>ノイズブランカー / VOX / VFO ロックが ON</w:t>
             </w:r>
           </w:p>
         </w:tc>
@@ -1573,59 +1857,20 @@
                 <w:rFonts w:ascii="Menlo" w:hAnsi="Menlo"/>
                 <w:sz w:val="19"/>
               </w:rPr>
-              <w:t>AF</w:t>
-            </w:r>
-            <w:r>
-              <w:rPr>
-                <w:sz w:val="19"/>
-              </w:rPr>
-              <w:t xml:space="preserve"> </w:t>
+              <w:t>AGC-F</w:t>
+            </w:r>
+            <w:r>
+              <w:rPr>
+                <w:sz w:val="19"/>
+              </w:rPr>
+              <w:t xml:space="preserve"> / </w:t>
             </w:r>
             <w:r>
               <w:rPr>
                 <w:rFonts w:ascii="Menlo" w:hAnsi="Menlo"/>
                 <w:sz w:val="19"/>
               </w:rPr>
-              <w:t>RF</w:t>
-            </w:r>
-            <w:r>
-              <w:rPr>
-                <w:sz w:val="19"/>
-              </w:rPr>
-              <w:t xml:space="preserve"> </w:t>
-            </w:r>
-            <w:r>
-              <w:rPr>
-                <w:rFonts w:ascii="Menlo" w:hAnsi="Menlo"/>
-                <w:sz w:val="19"/>
-              </w:rPr>
-              <w:t>PWR</w:t>
-            </w:r>
-            <w:r>
-              <w:rPr>
-                <w:sz w:val="19"/>
-              </w:rPr>
-              <w:t xml:space="preserve"> </w:t>
-            </w:r>
-            <w:r>
-              <w:rPr>
-                <w:rFonts w:ascii="Menlo" w:hAnsi="Menlo"/>
-                <w:sz w:val="19"/>
-              </w:rPr>
-              <w:t>BW</w:t>
-            </w:r>
-            <w:r>
-              <w:rPr>
-                <w:sz w:val="19"/>
-              </w:rPr>
-              <w:t xml:space="preserve"> </w:t>
-            </w:r>
-            <w:r>
-              <w:rPr>
-                <w:rFonts w:ascii="Menlo" w:hAnsi="Menlo"/>
-                <w:sz w:val="19"/>
-              </w:rPr>
-              <w:t>STEP</w:t>
+              <w:t>AGC-S</w:t>
             </w:r>
           </w:p>
         </w:tc>
@@ -1638,7 +1883,7 @@
               <w:rPr>
                 <w:sz w:val="19"/>
               </w:rPr>
-              <w:t>AF ゲイン、RF ゲイン（dB）、送信出力、帯域幅、ダイヤルのステップ</w:t>
+              <w:t>AGC の速さ（F: 速い、S: 遅い）</w:t>
             </w:r>
           </w:p>
         </w:tc>
@@ -1651,23 +1896,9 @@
           <w:p>
             <w:r>
               <w:rPr>
-                <w:rFonts w:ascii="Menlo" w:hAnsi="Menlo"/>
-                <w:sz w:val="19"/>
-              </w:rPr>
-              <w:t>NR</w:t>
-            </w:r>
-            <w:r>
-              <w:rPr>
-                <w:sz w:val="19"/>
-              </w:rPr>
-              <w:t xml:space="preserve"> </w:t>
-            </w:r>
-            <w:r>
-              <w:rPr>
-                <w:rFonts w:ascii="Menlo" w:hAnsi="Menlo"/>
-                <w:sz w:val="19"/>
-              </w:rPr>
-              <w:t>APF</w:t>
+                <w:sz w:val="19"/>
+              </w:rPr>
+              <w:t>周波数（大きな数字）</w:t>
             </w:r>
           </w:p>
         </w:tc>
@@ -1680,7 +1911,7 @@
               <w:rPr>
                 <w:sz w:val="19"/>
               </w:rPr>
-              <w:t>点灯しているときだけ表示します</w:t>
+              <w:t>VFO A。10 Hz の桁まで表示します（下 2 桁は小さく表示）。下線の付いた桁が、ダイヤル 1 目盛りの変化量（ステップ）です</w:t>
             </w:r>
           </w:p>
         </w:tc>
@@ -1693,10 +1924,9 @@
           <w:p>
             <w:r>
               <w:rPr>
-                <w:rFonts w:ascii="Menlo" w:hAnsi="Menlo"/>
-                <w:sz w:val="19"/>
-              </w:rPr>
-              <w:t>KNOB</w:t>
+                <w:sz w:val="19"/>
+              </w:rPr>
+              <w:t>モード</w:t>
             </w:r>
           </w:p>
         </w:tc>
@@ -1709,7 +1939,299 @@
               <w:rPr>
                 <w:sz w:val="19"/>
               </w:rPr>
-              <w:t>4 つの小さなつまみに今割り当てられている機能</w:t>
+              <w:t>LSB / USB / CW / CW-R / AM / FM / DATA / DATA-R</w:t>
+            </w:r>
+          </w:p>
+        </w:tc>
+      </w:tr>
+      <w:tr>
+        <w:tc>
+          <w:tcPr>
+            <w:tcW w:type="dxa" w:w="4819"/>
+          </w:tcPr>
+          <w:p>
+            <w:r>
+              <w:rPr>
+                <w:sz w:val="19"/>
+              </w:rPr>
+              <w:t>DATA のサブモード</w:t>
+            </w:r>
+          </w:p>
+        </w:tc>
+        <w:tc>
+          <w:tcPr>
+            <w:tcW w:type="dxa" w:w="4819"/>
+          </w:tcPr>
+          <w:p>
+            <w:r>
+              <w:rPr>
+                <w:sz w:val="19"/>
+              </w:rPr>
+              <w:t>DATA / DATA-R のとき、モードの下に DATA A / AFSK A / FSK D / PSK D を表示します</w:t>
+            </w:r>
+          </w:p>
+        </w:tc>
+      </w:tr>
+      <w:tr>
+        <w:tc>
+          <w:tcPr>
+            <w:tcW w:type="dxa" w:w="4819"/>
+          </w:tcPr>
+          <w:p>
+            <w:r>
+              <w:rPr>
+                <w:rFonts w:ascii="Menlo" w:hAnsi="Menlo"/>
+                <w:sz w:val="19"/>
+              </w:rPr>
+              <w:t>RIT ±x.xxk</w:t>
+            </w:r>
+            <w:r>
+              <w:rPr>
+                <w:sz w:val="19"/>
+              </w:rPr>
+              <w:t xml:space="preserve"> / </w:t>
+            </w:r>
+            <w:r>
+              <w:rPr>
+                <w:rFonts w:ascii="Menlo" w:hAnsi="Menlo"/>
+                <w:sz w:val="19"/>
+              </w:rPr>
+              <w:t>XIT ±x.xxk</w:t>
+            </w:r>
+          </w:p>
+        </w:tc>
+        <w:tc>
+          <w:tcPr>
+            <w:tcW w:type="dxa" w:w="4819"/>
+          </w:tcPr>
+          <w:p>
+            <w:r>
+              <w:rPr>
+                <w:sz w:val="19"/>
+              </w:rPr>
+              <w:t>RIT / XIT が ON のとき、オフセット（kHz）を表示します</w:t>
+            </w:r>
+          </w:p>
+        </w:tc>
+      </w:tr>
+      <w:tr>
+        <w:tc>
+          <w:tcPr>
+            <w:tcW w:type="dxa" w:w="4819"/>
+          </w:tcPr>
+          <w:p>
+            <w:r>
+              <w:rPr>
+                <w:rFonts w:ascii="Menlo" w:hAnsi="Menlo"/>
+                <w:sz w:val="19"/>
+              </w:rPr>
+              <w:t>VFO B</w:t>
+            </w:r>
+          </w:p>
+        </w:tc>
+        <w:tc>
+          <w:tcPr>
+            <w:tcW w:type="dxa" w:w="4819"/>
+          </w:tcPr>
+          <w:p>
+            <w:r>
+              <w:rPr>
+                <w:sz w:val="19"/>
+              </w:rPr>
+              <w:t>VFO B の周波数</w:t>
+            </w:r>
+          </w:p>
+        </w:tc>
+      </w:tr>
+      <w:tr>
+        <w:tc>
+          <w:tcPr>
+            <w:tcW w:type="dxa" w:w="4819"/>
+          </w:tcPr>
+          <w:p>
+            <w:r>
+              <w:rPr>
+                <w:sz w:val="19"/>
+              </w:rPr>
+              <w:t xml:space="preserve">バンド（例: </w:t>
+            </w:r>
+            <w:r>
+              <w:rPr>
+                <w:rFonts w:ascii="Menlo" w:hAnsi="Menlo"/>
+                <w:sz w:val="19"/>
+              </w:rPr>
+              <w:t>15m</w:t>
+            </w:r>
+            <w:r>
+              <w:rPr>
+                <w:sz w:val="19"/>
+              </w:rPr>
+              <w:t>）</w:t>
+            </w:r>
+          </w:p>
+        </w:tc>
+        <w:tc>
+          <w:tcPr>
+            <w:tcW w:type="dxa" w:w="4819"/>
+          </w:tcPr>
+          <w:p>
+            <w:r>
+              <w:rPr>
+                <w:sz w:val="19"/>
+              </w:rPr>
+              <w:t>現在のバンド（160m〜6m）</w:t>
+            </w:r>
+          </w:p>
+        </w:tc>
+      </w:tr>
+      <w:tr>
+        <w:tc>
+          <w:tcPr>
+            <w:tcW w:type="dxa" w:w="4819"/>
+          </w:tcPr>
+          <w:p>
+            <w:r>
+              <w:rPr>
+                <w:rFonts w:ascii="Menlo" w:hAnsi="Menlo"/>
+                <w:sz w:val="19"/>
+              </w:rPr>
+              <w:t>AF</w:t>
+            </w:r>
+            <w:r>
+              <w:rPr>
+                <w:sz w:val="19"/>
+              </w:rPr>
+              <w:t xml:space="preserve"> </w:t>
+            </w:r>
+            <w:r>
+              <w:rPr>
+                <w:rFonts w:ascii="Menlo" w:hAnsi="Menlo"/>
+                <w:sz w:val="19"/>
+              </w:rPr>
+              <w:t>RF</w:t>
+            </w:r>
+            <w:r>
+              <w:rPr>
+                <w:sz w:val="19"/>
+              </w:rPr>
+              <w:t xml:space="preserve"> </w:t>
+            </w:r>
+            <w:r>
+              <w:rPr>
+                <w:rFonts w:ascii="Menlo" w:hAnsi="Menlo"/>
+                <w:sz w:val="19"/>
+              </w:rPr>
+              <w:t>PWR</w:t>
+            </w:r>
+            <w:r>
+              <w:rPr>
+                <w:sz w:val="19"/>
+              </w:rPr>
+              <w:t xml:space="preserve"> </w:t>
+            </w:r>
+            <w:r>
+              <w:rPr>
+                <w:rFonts w:ascii="Menlo" w:hAnsi="Menlo"/>
+                <w:sz w:val="19"/>
+              </w:rPr>
+              <w:t>BW</w:t>
+            </w:r>
+            <w:r>
+              <w:rPr>
+                <w:sz w:val="19"/>
+              </w:rPr>
+              <w:t xml:space="preserve"> </w:t>
+            </w:r>
+            <w:r>
+              <w:rPr>
+                <w:rFonts w:ascii="Menlo" w:hAnsi="Menlo"/>
+                <w:sz w:val="19"/>
+              </w:rPr>
+              <w:t>STEP</w:t>
+            </w:r>
+          </w:p>
+        </w:tc>
+        <w:tc>
+          <w:tcPr>
+            <w:tcW w:type="dxa" w:w="4819"/>
+          </w:tcPr>
+          <w:p>
+            <w:r>
+              <w:rPr>
+                <w:sz w:val="19"/>
+              </w:rPr>
+              <w:t>AF ゲイン（0〜60）、RF ゲイン（0〜−60 dB）、送信出力、受信帯域幅、ダイヤルのステップ</w:t>
+            </w:r>
+          </w:p>
+        </w:tc>
+      </w:tr>
+      <w:tr>
+        <w:tc>
+          <w:tcPr>
+            <w:tcW w:type="dxa" w:w="4819"/>
+          </w:tcPr>
+          <w:p>
+            <w:r>
+              <w:rPr>
+                <w:rFonts w:ascii="Menlo" w:hAnsi="Menlo"/>
+                <w:sz w:val="19"/>
+              </w:rPr>
+              <w:t>NR</w:t>
+            </w:r>
+            <w:r>
+              <w:rPr>
+                <w:sz w:val="19"/>
+              </w:rPr>
+              <w:t xml:space="preserve"> </w:t>
+            </w:r>
+            <w:r>
+              <w:rPr>
+                <w:rFonts w:ascii="Menlo" w:hAnsi="Menlo"/>
+                <w:sz w:val="19"/>
+              </w:rPr>
+              <w:t>APF</w:t>
+            </w:r>
+          </w:p>
+        </w:tc>
+        <w:tc>
+          <w:tcPr>
+            <w:tcW w:type="dxa" w:w="4819"/>
+          </w:tcPr>
+          <w:p>
+            <w:r>
+              <w:rPr>
+                <w:sz w:val="19"/>
+              </w:rPr>
+              <w:t>ノイズリダクション / オーディオピークフィルタが ON のときだけ表示します</w:t>
+            </w:r>
+          </w:p>
+        </w:tc>
+      </w:tr>
+      <w:tr>
+        <w:tc>
+          <w:tcPr>
+            <w:tcW w:type="dxa" w:w="4819"/>
+          </w:tcPr>
+          <w:p>
+            <w:r>
+              <w:rPr>
+                <w:rFonts w:ascii="Menlo" w:hAnsi="Menlo"/>
+                <w:sz w:val="19"/>
+              </w:rPr>
+              <w:t>KNOB</w:t>
+            </w:r>
+          </w:p>
+        </w:tc>
+        <w:tc>
+          <w:tcPr>
+            <w:tcW w:type="dxa" w:w="4819"/>
+          </w:tcPr>
+          <w:p>
+            <w:r>
+              <w:rPr>
+                <w:sz w:val="19"/>
+              </w:rPr>
+              <w:t>4 つの小さなつまみに今割り当てられている機能（左から AF/RF-SQL、PBT、KEYER/MIC、OFS/B）</w:t>
             </w:r>
           </w:p>
         </w:tc>
@@ -1730,6 +2252,11 @@
       </w:pPr>
       <w:r>
         <w:t>5.1 キーの押し方</w:t>
+      </w:r>
+    </w:p>
+    <w:p>
+      <w:r>
+        <w:t>KX3 画面のキーは、本体のキーと同じく 2 通りの押し方があります。</w:t>
       </w:r>
     </w:p>
     <w:p>
@@ -1782,7 +2309,15 @@
     </w:p>
     <w:p>
       <w:r>
-        <w:t>キーを押すと、本体の同じキーを押したのと同じ動作をします（KX3 の CAT のスイッチ操作コマンドを使います）。押した後、本体の状態を読み直して表示を合わせます。各機能の詳しい動きは、KX3 本体の取扱説明書を参照してください。</w:t>
+        <w:t>キーを押すと、本体の同じキーを押したのと同じ命令を KX3 に送ります。押した後、本体の状態を読み直して LCD の表示を合わせます。各機能の詳しい動きは、KX3 本体の取扱説明書（KX3 Owner's Manual）を参照してください。</w:t>
+      </w:r>
+    </w:p>
+    <w:p>
+      <w:pPr>
+        <w:pStyle w:val="Heading2"/>
+      </w:pPr>
+      <w:r>
+        <w:t>5.2 前面パネルのキー</w:t>
       </w:r>
     </w:p>
     <w:tbl>
@@ -1853,19 +2388,6 @@
               </w:rPr>
               <w:t>BAND+</w:t>
             </w:r>
-            <w:r>
-              <w:rPr>
-                <w:sz w:val="19"/>
-              </w:rPr>
-              <w:t xml:space="preserve"> / </w:t>
-            </w:r>
-            <w:r>
-              <w:rPr>
-                <w:rFonts w:ascii="Menlo" w:hAnsi="Menlo"/>
-                <w:sz w:val="19"/>
-              </w:rPr>
-              <w:t>BAND−</w:t>
-            </w:r>
           </w:p>
         </w:tc>
         <w:tc>
@@ -1877,7 +2399,7 @@
               <w:rPr>
                 <w:sz w:val="19"/>
               </w:rPr>
-              <w:t>上 / 下のバンドへ</w:t>
+              <w:t>上のバンドへ</w:t>
             </w:r>
           </w:p>
         </w:tc>
@@ -1897,20 +2419,7 @@
               <w:rPr>
                 <w:sz w:val="19"/>
               </w:rPr>
-              <w:t xml:space="preserve">（メモリー呼び出し） / </w:t>
-            </w:r>
-            <w:r>
-              <w:rPr>
-                <w:rFonts w:ascii="Menlo" w:hAnsi="Menlo"/>
-                <w:sz w:val="19"/>
-              </w:rPr>
-              <w:t>STORE</w:t>
-            </w:r>
-            <w:r>
-              <w:rPr>
-                <w:sz w:val="19"/>
-              </w:rPr>
-              <w:t>（メモリー書き込み）</w:t>
+              <w:t>（メモリーの呼び出し）</w:t>
             </w:r>
           </w:p>
         </w:tc>
@@ -1926,7 +2435,7 @@
                 <w:rFonts w:ascii="Menlo" w:hAnsi="Menlo"/>
                 <w:sz w:val="19"/>
               </w:rPr>
-              <w:t>FREQ ENT</w:t>
+              <w:t>BAND−</w:t>
             </w:r>
           </w:p>
         </w:tc>
@@ -1939,7 +2448,7 @@
               <w:rPr>
                 <w:sz w:val="19"/>
               </w:rPr>
-              <w:t>キーパッドで周波数入力</w:t>
+              <w:t>下のバンドへ</w:t>
             </w:r>
           </w:p>
         </w:tc>
@@ -1953,13 +2462,13 @@
                 <w:rFonts w:ascii="Menlo" w:hAnsi="Menlo"/>
                 <w:sz w:val="19"/>
               </w:rPr>
-              <w:t>SCAN</w:t>
-            </w:r>
-            <w:r>
-              <w:rPr>
-                <w:sz w:val="19"/>
-              </w:rPr>
-              <w:t>（スキャン）</w:t>
+              <w:t>STORE</w:t>
+            </w:r>
+            <w:r>
+              <w:rPr>
+                <w:sz w:val="19"/>
+              </w:rPr>
+              <w:t>（メモリーへの書き込み）</w:t>
             </w:r>
           </w:p>
         </w:tc>
@@ -1975,7 +2484,7 @@
                 <w:rFonts w:ascii="Menlo" w:hAnsi="Menlo"/>
                 <w:sz w:val="19"/>
               </w:rPr>
-              <w:t>MSG</w:t>
+              <w:t>FREQ ENT</w:t>
             </w:r>
           </w:p>
         </w:tc>
@@ -1988,7 +2497,20 @@
               <w:rPr>
                 <w:sz w:val="19"/>
               </w:rPr>
-              <w:t>メッセージ再生</w:t>
+              <w:t>キーパッドで周波数を入力（</w:t>
+            </w:r>
+            <w:r>
+              <w:rPr>
+                <w:color w:val="0645AD"/>
+                <w:sz w:val="19"/>
+              </w:rPr>
+              <w:t>5.4</w:t>
+            </w:r>
+            <w:r>
+              <w:rPr>
+                <w:sz w:val="19"/>
+              </w:rPr>
+              <w:t xml:space="preserve"> 参照）</w:t>
             </w:r>
           </w:p>
         </w:tc>
@@ -2002,13 +2524,13 @@
                 <w:rFonts w:ascii="Menlo" w:hAnsi="Menlo"/>
                 <w:sz w:val="19"/>
               </w:rPr>
-              <w:t>REC</w:t>
-            </w:r>
-            <w:r>
-              <w:rPr>
-                <w:sz w:val="19"/>
-              </w:rPr>
-              <w:t>（メッセージ録音）</w:t>
+              <w:t>SCAN</w:t>
+            </w:r>
+            <w:r>
+              <w:rPr>
+                <w:sz w:val="19"/>
+              </w:rPr>
+              <w:t>（スキャン）</w:t>
             </w:r>
           </w:p>
         </w:tc>
@@ -2024,7 +2546,7 @@
                 <w:rFonts w:ascii="Menlo" w:hAnsi="Menlo"/>
                 <w:sz w:val="19"/>
               </w:rPr>
-              <w:t>ATU TUNE</w:t>
+              <w:t>MSG</w:t>
             </w:r>
           </w:p>
         </w:tc>
@@ -2037,7 +2559,7 @@
               <w:rPr>
                 <w:sz w:val="19"/>
               </w:rPr>
-              <w:t>内蔵 ATU でチューニング（短時間送信します）</w:t>
+              <w:t>録音したメッセージの再生</w:t>
             </w:r>
           </w:p>
         </w:tc>
@@ -2051,13 +2573,13 @@
                 <w:rFonts w:ascii="Menlo" w:hAnsi="Menlo"/>
                 <w:sz w:val="19"/>
               </w:rPr>
-              <w:t>ANT</w:t>
-            </w:r>
-            <w:r>
-              <w:rPr>
-                <w:sz w:val="19"/>
-              </w:rPr>
-              <w:t>（アンテナ切替）</w:t>
+              <w:t>REC</w:t>
+            </w:r>
+            <w:r>
+              <w:rPr>
+                <w:sz w:val="19"/>
+              </w:rPr>
+              <w:t>（メッセージの録音）</w:t>
             </w:r>
           </w:p>
         </w:tc>
@@ -2073,7 +2595,7 @@
                 <w:rFonts w:ascii="Menlo" w:hAnsi="Menlo"/>
                 <w:sz w:val="19"/>
               </w:rPr>
-              <w:t>XMIT</w:t>
+              <w:t>ATU TUNE</w:t>
             </w:r>
           </w:p>
         </w:tc>
@@ -2086,20 +2608,7 @@
               <w:rPr>
                 <w:sz w:val="19"/>
               </w:rPr>
-              <w:t>送信 / 受信の切替（</w:t>
-            </w:r>
-            <w:r>
-              <w:rPr>
-                <w:rFonts w:ascii="Menlo" w:hAnsi="Menlo"/>
-                <w:sz w:val="19"/>
-              </w:rPr>
-              <w:t>送信 (PTT)</w:t>
-            </w:r>
-            <w:r>
-              <w:rPr>
-                <w:sz w:val="19"/>
-              </w:rPr>
-              <w:t xml:space="preserve"> と同じ）</w:t>
+              <w:t>内蔵 ATU でチューニング（短時間送信します）</w:t>
             </w:r>
           </w:p>
         </w:tc>
@@ -2113,13 +2622,13 @@
                 <w:rFonts w:ascii="Menlo" w:hAnsi="Menlo"/>
                 <w:sz w:val="19"/>
               </w:rPr>
-              <w:t>TUNE</w:t>
-            </w:r>
-            <w:r>
-              <w:rPr>
-                <w:sz w:val="19"/>
-              </w:rPr>
-              <w:t>（チューン送信）</w:t>
+              <w:t>ANT</w:t>
+            </w:r>
+            <w:r>
+              <w:rPr>
+                <w:sz w:val="19"/>
+              </w:rPr>
+              <w:t>（アンテナ切替）</w:t>
             </w:r>
           </w:p>
         </w:tc>
@@ -2135,7 +2644,7 @@
                 <w:rFonts w:ascii="Menlo" w:hAnsi="Menlo"/>
                 <w:sz w:val="19"/>
               </w:rPr>
-              <w:t>PRE 1</w:t>
+              <w:t>XMIT</w:t>
             </w:r>
           </w:p>
         </w:tc>
@@ -2148,7 +2657,20 @@
               <w:rPr>
                 <w:sz w:val="19"/>
               </w:rPr>
-              <w:t>プリアンプ</w:t>
+              <w:t>送信 / 受信の切替（</w:t>
+            </w:r>
+            <w:r>
+              <w:rPr>
+                <w:rFonts w:ascii="Menlo" w:hAnsi="Menlo"/>
+                <w:sz w:val="19"/>
+              </w:rPr>
+              <w:t>送信 (PTT)</w:t>
+            </w:r>
+            <w:r>
+              <w:rPr>
+                <w:sz w:val="19"/>
+              </w:rPr>
+              <w:t xml:space="preserve"> と同じ）</w:t>
             </w:r>
           </w:p>
         </w:tc>
@@ -2162,13 +2684,13 @@
                 <w:rFonts w:ascii="Menlo" w:hAnsi="Menlo"/>
                 <w:sz w:val="19"/>
               </w:rPr>
-              <w:t>NR</w:t>
-            </w:r>
-            <w:r>
-              <w:rPr>
-                <w:sz w:val="19"/>
-              </w:rPr>
-              <w:t>（ノイズリダクション）</w:t>
+              <w:t>TUNE</w:t>
+            </w:r>
+            <w:r>
+              <w:rPr>
+                <w:sz w:val="19"/>
+              </w:rPr>
+              <w:t>（チューン送信）</w:t>
             </w:r>
           </w:p>
         </w:tc>
@@ -2184,7 +2706,7 @@
                 <w:rFonts w:ascii="Menlo" w:hAnsi="Menlo"/>
                 <w:sz w:val="19"/>
               </w:rPr>
-              <w:t>ATTN 2</w:t>
+              <w:t>PRE 1</w:t>
             </w:r>
           </w:p>
         </w:tc>
@@ -2197,7 +2719,7 @@
               <w:rPr>
                 <w:sz w:val="19"/>
               </w:rPr>
-              <w:t>アッテネーター</w:t>
+              <w:t>プリアンプ ON / OFF</w:t>
             </w:r>
           </w:p>
         </w:tc>
@@ -2211,13 +2733,13 @@
                 <w:rFonts w:ascii="Menlo" w:hAnsi="Menlo"/>
                 <w:sz w:val="19"/>
               </w:rPr>
-              <w:t>NB</w:t>
-            </w:r>
-            <w:r>
-              <w:rPr>
-                <w:sz w:val="19"/>
-              </w:rPr>
-              <w:t>（ノイズブランカー）</w:t>
+              <w:t>NR</w:t>
+            </w:r>
+            <w:r>
+              <w:rPr>
+                <w:sz w:val="19"/>
+              </w:rPr>
+              <w:t>（ノイズリダクション）</w:t>
             </w:r>
           </w:p>
         </w:tc>
@@ -2233,7 +2755,7 @@
                 <w:rFonts w:ascii="Menlo" w:hAnsi="Menlo"/>
                 <w:sz w:val="19"/>
               </w:rPr>
-              <w:t>APF 3</w:t>
+              <w:t>ATTN 2</w:t>
             </w:r>
           </w:p>
         </w:tc>
@@ -2246,7 +2768,7 @@
               <w:rPr>
                 <w:sz w:val="19"/>
               </w:rPr>
-              <w:t>オーディオピークフィルタ</w:t>
+              <w:t>アッテネーター ON / OFF</w:t>
             </w:r>
           </w:p>
         </w:tc>
@@ -2260,13 +2782,13 @@
                 <w:rFonts w:ascii="Menlo" w:hAnsi="Menlo"/>
                 <w:sz w:val="19"/>
               </w:rPr>
-              <w:t>NTCH</w:t>
-            </w:r>
-            <w:r>
-              <w:rPr>
-                <w:sz w:val="19"/>
-              </w:rPr>
-              <w:t>（ノッチ）</w:t>
+              <w:t>NB</w:t>
+            </w:r>
+            <w:r>
+              <w:rPr>
+                <w:sz w:val="19"/>
+              </w:rPr>
+              <w:t>（ノイズブランカー）</w:t>
             </w:r>
           </w:p>
         </w:tc>
@@ -2282,7 +2804,7 @@
                 <w:rFonts w:ascii="Menlo" w:hAnsi="Menlo"/>
                 <w:sz w:val="19"/>
               </w:rPr>
-              <w:t>SPOT 4</w:t>
+              <w:t>APF 3</w:t>
             </w:r>
           </w:p>
         </w:tc>
@@ -2295,7 +2817,7 @@
               <w:rPr>
                 <w:sz w:val="19"/>
               </w:rPr>
-              <w:t>CW スポット</w:t>
+              <w:t>オーディオピークフィルタ（CW）</w:t>
             </w:r>
           </w:p>
         </w:tc>
@@ -2309,13 +2831,13 @@
                 <w:rFonts w:ascii="Menlo" w:hAnsi="Menlo"/>
                 <w:sz w:val="19"/>
               </w:rPr>
-              <w:t>CWT</w:t>
-            </w:r>
-            <w:r>
-              <w:rPr>
-                <w:sz w:val="19"/>
-              </w:rPr>
-              <w:t>（CW チューニング表示）</w:t>
+              <w:t>NTCH</w:t>
+            </w:r>
+            <w:r>
+              <w:rPr>
+                <w:sz w:val="19"/>
+              </w:rPr>
+              <w:t>（ノッチ）</w:t>
             </w:r>
           </w:p>
         </w:tc>
@@ -2331,7 +2853,7 @@
                 <w:rFonts w:ascii="Menlo" w:hAnsi="Menlo"/>
                 <w:sz w:val="19"/>
               </w:rPr>
-              <w:t>CMP 5</w:t>
+              <w:t>SPOT 4</w:t>
             </w:r>
           </w:p>
         </w:tc>
@@ -2344,7 +2866,7 @@
               <w:rPr>
                 <w:sz w:val="19"/>
               </w:rPr>
-              <w:t>スピーチコンプレッサ</w:t>
+              <w:t>CW スポット（相手の信号に合わせる）</w:t>
             </w:r>
           </w:p>
         </w:tc>
@@ -2358,13 +2880,13 @@
                 <w:rFonts w:ascii="Menlo" w:hAnsi="Menlo"/>
                 <w:sz w:val="19"/>
               </w:rPr>
-              <w:t>PITCH</w:t>
-            </w:r>
-            <w:r>
-              <w:rPr>
-                <w:sz w:val="19"/>
-              </w:rPr>
-              <w:t>（CW ピッチ）</w:t>
+              <w:t>CWT</w:t>
+            </w:r>
+            <w:r>
+              <w:rPr>
+                <w:sz w:val="19"/>
+              </w:rPr>
+              <w:t>（CW チューニング表示）</w:t>
             </w:r>
           </w:p>
         </w:tc>
@@ -2380,7 +2902,7 @@
                 <w:rFonts w:ascii="Menlo" w:hAnsi="Menlo"/>
                 <w:sz w:val="19"/>
               </w:rPr>
-              <w:t>DLY 6</w:t>
+              <w:t>CMP 5</w:t>
             </w:r>
           </w:p>
         </w:tc>
@@ -2393,7 +2915,7 @@
               <w:rPr>
                 <w:sz w:val="19"/>
               </w:rPr>
-              <w:t>送受切替ディレイ</w:t>
+              <w:t>スピーチコンプレッサ</w:t>
             </w:r>
           </w:p>
         </w:tc>
@@ -2407,7 +2929,13 @@
                 <w:rFonts w:ascii="Menlo" w:hAnsi="Menlo"/>
                 <w:sz w:val="19"/>
               </w:rPr>
-              <w:t>VOX</w:t>
+              <w:t>PITCH</w:t>
+            </w:r>
+            <w:r>
+              <w:rPr>
+                <w:sz w:val="19"/>
+              </w:rPr>
+              <w:t>（CW ピッチ）</w:t>
             </w:r>
           </w:p>
         </w:tc>
@@ -2423,7 +2951,7 @@
                 <w:rFonts w:ascii="Menlo" w:hAnsi="Menlo"/>
                 <w:sz w:val="19"/>
               </w:rPr>
-              <w:t>MODE</w:t>
+              <w:t>DLY 6</w:t>
             </w:r>
           </w:p>
         </w:tc>
@@ -2436,7 +2964,7 @@
               <w:rPr>
                 <w:sz w:val="19"/>
               </w:rPr>
-              <w:t>モード切替</w:t>
+              <w:t>送受切替ディレイ（QSK / VOX）</w:t>
             </w:r>
           </w:p>
         </w:tc>
@@ -2450,13 +2978,7 @@
                 <w:rFonts w:ascii="Menlo" w:hAnsi="Menlo"/>
                 <w:sz w:val="19"/>
               </w:rPr>
-              <w:t>ALT</w:t>
-            </w:r>
-            <w:r>
-              <w:rPr>
-                <w:sz w:val="19"/>
-              </w:rPr>
-              <w:t>（逆サイドバンドなど）</w:t>
+              <w:t>VOX</w:t>
             </w:r>
           </w:p>
         </w:tc>
@@ -2472,7 +2994,7 @@
                 <w:rFonts w:ascii="Menlo" w:hAnsi="Menlo"/>
                 <w:sz w:val="19"/>
               </w:rPr>
-              <w:t>DATA</w:t>
+              <w:t>MODE</w:t>
             </w:r>
           </w:p>
         </w:tc>
@@ -2485,7 +3007,7 @@
               <w:rPr>
                 <w:sz w:val="19"/>
               </w:rPr>
-              <w:t>DATA モード</w:t>
+              <w:t>モードの切替</w:t>
             </w:r>
           </w:p>
         </w:tc>
@@ -2499,13 +3021,13 @@
                 <w:rFonts w:ascii="Menlo" w:hAnsi="Menlo"/>
                 <w:sz w:val="19"/>
               </w:rPr>
-              <w:t>TEXT</w:t>
-            </w:r>
-            <w:r>
-              <w:rPr>
-                <w:sz w:val="19"/>
-              </w:rPr>
-              <w:t>（文字デコード）</w:t>
+              <w:t>ALT</w:t>
+            </w:r>
+            <w:r>
+              <w:rPr>
+                <w:sz w:val="19"/>
+              </w:rPr>
+              <w:t>（逆サイドバンドなど）</w:t>
             </w:r>
           </w:p>
         </w:tc>
@@ -2521,20 +3043,7 @@
                 <w:rFonts w:ascii="Menlo" w:hAnsi="Menlo"/>
                 <w:sz w:val="19"/>
               </w:rPr>
-              <w:t>RIT</w:t>
-            </w:r>
-            <w:r>
-              <w:rPr>
-                <w:sz w:val="19"/>
-              </w:rPr>
-              <w:t xml:space="preserve"> / </w:t>
-            </w:r>
-            <w:r>
-              <w:rPr>
-                <w:rFonts w:ascii="Menlo" w:hAnsi="Menlo"/>
-                <w:sz w:val="19"/>
-              </w:rPr>
-              <w:t>XIT</w:t>
+              <w:t>DATA</w:t>
             </w:r>
           </w:p>
         </w:tc>
@@ -2547,7 +3056,7 @@
               <w:rPr>
                 <w:sz w:val="19"/>
               </w:rPr>
-              <w:t>RIT / XIT の ON / OFF</w:t>
+              <w:t>DATA モード</w:t>
             </w:r>
           </w:p>
         </w:tc>
@@ -2561,26 +3070,13 @@
                 <w:rFonts w:ascii="Menlo" w:hAnsi="Menlo"/>
                 <w:sz w:val="19"/>
               </w:rPr>
-              <w:t>PF1</w:t>
-            </w:r>
-            <w:r>
-              <w:rPr>
-                <w:sz w:val="19"/>
-              </w:rPr>
-              <w:t xml:space="preserve"> / </w:t>
-            </w:r>
-            <w:r>
-              <w:rPr>
-                <w:rFonts w:ascii="Menlo" w:hAnsi="Menlo"/>
-                <w:sz w:val="19"/>
-              </w:rPr>
-              <w:t>PF2</w:t>
-            </w:r>
-            <w:r>
-              <w:rPr>
-                <w:sz w:val="19"/>
-              </w:rPr>
-              <w:t>（プログラマブルキー）</w:t>
+              <w:t>TEXT</w:t>
+            </w:r>
+            <w:r>
+              <w:rPr>
+                <w:sz w:val="19"/>
+              </w:rPr>
+              <w:t>（文字デコード）</w:t>
             </w:r>
           </w:p>
         </w:tc>
@@ -2596,7 +3092,7 @@
                 <w:rFonts w:ascii="Menlo" w:hAnsi="Menlo"/>
                 <w:sz w:val="19"/>
               </w:rPr>
-              <w:t>RATE</w:t>
+              <w:t>RIT</w:t>
             </w:r>
           </w:p>
         </w:tc>
@@ -2609,7 +3105,7 @@
               <w:rPr>
                 <w:sz w:val="19"/>
               </w:rPr>
-              <w:t>VFO の変化量</w:t>
+              <w:t>RIT ON / OFF</w:t>
             </w:r>
           </w:p>
         </w:tc>
@@ -2623,7 +3119,13 @@
                 <w:rFonts w:ascii="Menlo" w:hAnsi="Menlo"/>
                 <w:sz w:val="19"/>
               </w:rPr>
-              <w:t>KHZ</w:t>
+              <w:t>PF1</w:t>
+            </w:r>
+            <w:r>
+              <w:rPr>
+                <w:sz w:val="19"/>
+              </w:rPr>
+              <w:t>（プログラマブルキー 1）</w:t>
             </w:r>
           </w:p>
         </w:tc>
@@ -2639,7 +3141,7 @@
                 <w:rFonts w:ascii="Menlo" w:hAnsi="Menlo"/>
                 <w:sz w:val="19"/>
               </w:rPr>
-              <w:t>A / B</w:t>
+              <w:t>RATE</w:t>
             </w:r>
           </w:p>
         </w:tc>
@@ -2652,7 +3154,7 @@
               <w:rPr>
                 <w:sz w:val="19"/>
               </w:rPr>
-              <w:t>VFO A と B の入れ替え</w:t>
+              <w:t>ダイヤルの変化量の切替</w:t>
             </w:r>
           </w:p>
         </w:tc>
@@ -2666,7 +3168,7 @@
                 <w:rFonts w:ascii="Menlo" w:hAnsi="Menlo"/>
                 <w:sz w:val="19"/>
               </w:rPr>
-              <w:t>REV</w:t>
+              <w:t>KHZ</w:t>
             </w:r>
           </w:p>
         </w:tc>
@@ -2682,7 +3184,7 @@
                 <w:rFonts w:ascii="Menlo" w:hAnsi="Menlo"/>
                 <w:sz w:val="19"/>
               </w:rPr>
-              <w:t>A → B</w:t>
+              <w:t>A / B</w:t>
             </w:r>
           </w:p>
         </w:tc>
@@ -2695,7 +3197,7 @@
               <w:rPr>
                 <w:sz w:val="19"/>
               </w:rPr>
-              <w:t>VFO A を B へコピー</w:t>
+              <w:t>VFO A と B の入れ替え</w:t>
             </w:r>
           </w:p>
         </w:tc>
@@ -2709,13 +3211,13 @@
                 <w:rFonts w:ascii="Menlo" w:hAnsi="Menlo"/>
                 <w:sz w:val="19"/>
               </w:rPr>
-              <w:t>SPLIT</w:t>
-            </w:r>
-            <w:r>
-              <w:rPr>
-                <w:sz w:val="19"/>
-              </w:rPr>
-              <w:t>（スプリット）</w:t>
+              <w:t>REV</w:t>
+            </w:r>
+            <w:r>
+              <w:rPr>
+                <w:sz w:val="19"/>
+              </w:rPr>
+              <w:t>（FM レピーターのリバース）</w:t>
             </w:r>
           </w:p>
         </w:tc>
@@ -2731,7 +3233,7 @@
                 <w:rFonts w:ascii="Menlo" w:hAnsi="Menlo"/>
                 <w:sz w:val="19"/>
               </w:rPr>
-              <w:t>DISP</w:t>
+              <w:t>A → B</w:t>
             </w:r>
           </w:p>
         </w:tc>
@@ -2744,7 +3246,7 @@
               <w:rPr>
                 <w:sz w:val="19"/>
               </w:rPr>
-              <w:t>表示切替</w:t>
+              <w:t>VFO A の周波数を B へコピー</w:t>
             </w:r>
           </w:p>
         </w:tc>
@@ -2758,6 +3260,104 @@
                 <w:rFonts w:ascii="Menlo" w:hAnsi="Menlo"/>
                 <w:sz w:val="19"/>
               </w:rPr>
+              <w:t>SPLIT</w:t>
+            </w:r>
+            <w:r>
+              <w:rPr>
+                <w:sz w:val="19"/>
+              </w:rPr>
+              <w:t>（スプリット ON / OFF）</w:t>
+            </w:r>
+          </w:p>
+        </w:tc>
+      </w:tr>
+      <w:tr>
+        <w:tc>
+          <w:tcPr>
+            <w:tcW w:type="dxa" w:w="3213"/>
+          </w:tcPr>
+          <w:p>
+            <w:r>
+              <w:rPr>
+                <w:rFonts w:ascii="Menlo" w:hAnsi="Menlo"/>
+                <w:sz w:val="19"/>
+              </w:rPr>
+              <w:t>XIT</w:t>
+            </w:r>
+          </w:p>
+        </w:tc>
+        <w:tc>
+          <w:tcPr>
+            <w:tcW w:type="dxa" w:w="3213"/>
+          </w:tcPr>
+          <w:p>
+            <w:r>
+              <w:rPr>
+                <w:sz w:val="19"/>
+              </w:rPr>
+              <w:t>XIT ON / OFF</w:t>
+            </w:r>
+          </w:p>
+        </w:tc>
+        <w:tc>
+          <w:tcPr>
+            <w:tcW w:type="dxa" w:w="3213"/>
+          </w:tcPr>
+          <w:p>
+            <w:r>
+              <w:rPr>
+                <w:rFonts w:ascii="Menlo" w:hAnsi="Menlo"/>
+                <w:sz w:val="19"/>
+              </w:rPr>
+              <w:t>PF2</w:t>
+            </w:r>
+            <w:r>
+              <w:rPr>
+                <w:sz w:val="19"/>
+              </w:rPr>
+              <w:t>（プログラマブルキー 2）</w:t>
+            </w:r>
+          </w:p>
+        </w:tc>
+      </w:tr>
+      <w:tr>
+        <w:tc>
+          <w:tcPr>
+            <w:tcW w:type="dxa" w:w="3213"/>
+          </w:tcPr>
+          <w:p>
+            <w:r>
+              <w:rPr>
+                <w:rFonts w:ascii="Menlo" w:hAnsi="Menlo"/>
+                <w:sz w:val="19"/>
+              </w:rPr>
+              <w:t>DISP</w:t>
+            </w:r>
+          </w:p>
+        </w:tc>
+        <w:tc>
+          <w:tcPr>
+            <w:tcW w:type="dxa" w:w="3213"/>
+          </w:tcPr>
+          <w:p>
+            <w:r>
+              <w:rPr>
+                <w:sz w:val="19"/>
+              </w:rPr>
+              <w:t>表示の切替</w:t>
+            </w:r>
+          </w:p>
+        </w:tc>
+        <w:tc>
+          <w:tcPr>
+            <w:tcW w:type="dxa" w:w="3213"/>
+          </w:tcPr>
+          <w:p>
+            <w:r>
+              <w:rPr>
+                <w:rFonts w:ascii="Menlo" w:hAnsi="Menlo"/>
+                <w:sz w:val="19"/>
+              </w:rPr>
               <w:t>MENU</w:t>
             </w:r>
             <w:r>
@@ -2773,7 +3373,27 @@
     <w:p/>
     <w:p>
       <w:r>
-        <w:t>数字は、</w:t>
+        <w:t>キー名の後の数字（</w:t>
+      </w:r>
+      <w:r>
+        <w:rPr>
+          <w:rFonts w:ascii="Menlo" w:hAnsi="Menlo"/>
+          <w:sz w:val="18"/>
+        </w:rPr>
+        <w:t>PRE 1</w:t>
+      </w:r>
+      <w:r>
+        <w:t xml:space="preserve"> の </w:t>
+      </w:r>
+      <w:r>
+        <w:rPr>
+          <w:rFonts w:ascii="Menlo" w:hAnsi="Menlo"/>
+          <w:sz w:val="18"/>
+        </w:rPr>
+        <w:t>1</w:t>
+      </w:r>
+      <w:r>
+        <w:t xml:space="preserve"> など）は、</w:t>
       </w:r>
       <w:r>
         <w:rPr>
@@ -2791,12 +3411,12 @@
         <w:pStyle w:val="Heading2"/>
       </w:pPr>
       <w:r>
-        <w:t>5.2 つまみ</w:t>
+        <w:t>5.3 つまみ</w:t>
       </w:r>
     </w:p>
     <w:p>
       <w:r>
-        <w:t xml:space="preserve">小さなつまみは、本体と同じく、下の押しボタンを短く押すたびに回したときの機能が切り替わります。今の機能は LCD の </w:t>
+        <w:t xml:space="preserve">小さなつまみは、本体と同じく、下の押しボタンを短く押すたびに回したときの機能が切り替わります。今の機能は、つまみの下の緑色の文字と、LCD の </w:t>
       </w:r>
       <w:r>
         <w:rPr>
@@ -2806,7 +3426,7 @@
         <w:t>KNOB</w:t>
       </w:r>
       <w:r>
-        <w:t xml:space="preserve"> 行と、つまみの下の緑色の文字で確認できます。</w:t>
+        <w:t xml:space="preserve"> 行で確認できます。</w:t>
       </w:r>
     </w:p>
     <w:tbl>
@@ -2902,7 +3522,7 @@
               <w:rPr>
                 <w:sz w:val="19"/>
               </w:rPr>
-              <w:t>AF ゲイン ⇔ RF ゲイン（FM のときはスケルチ）</w:t>
+              <w:t>AF ゲイン（0〜60） ⇔ RF ゲイン（0〜−60 dB）。FM のときは RF の代わりにスケルチ（0〜29）</w:t>
             </w:r>
           </w:p>
         </w:tc>
@@ -2963,7 +3583,7 @@
               <w:rPr>
                 <w:sz w:val="19"/>
               </w:rPr>
-              <w:t>帯域幅（I、50 Hz ずつ）⇔ シフト（II、10 Hz ずつ）</w:t>
+              <w:t>帯域幅（I、50 Hz ずつ） ⇔ シフト（II、通過帯域の中心、10 Hz ずつ）</w:t>
             </w:r>
           </w:p>
         </w:tc>
@@ -3024,7 +3644,7 @@
               <w:rPr>
                 <w:sz w:val="19"/>
               </w:rPr>
-              <w:t>CW ではキーヤー速度、それ以外はマイクゲイン</w:t>
+              <w:t>CW ではキーヤー速度（8〜50 WPM）、それ以外はマイクゲイン</w:t>
             </w:r>
           </w:p>
         </w:tc>
@@ -3035,9 +3655,16 @@
           <w:p>
             <w:r>
               <w:rPr>
-                <w:sz w:val="19"/>
-              </w:rPr>
-              <w:t>PWR から元の機能へ戻す</w:t>
+                <w:rFonts w:ascii="Menlo" w:hAnsi="Menlo"/>
+                <w:sz w:val="19"/>
+              </w:rPr>
+              <w:t>PWR</w:t>
+            </w:r>
+            <w:r>
+              <w:rPr>
+                <w:sz w:val="19"/>
+              </w:rPr>
+              <w:t xml:space="preserve"> から元の機能へ戻す</w:t>
             </w:r>
           </w:p>
         </w:tc>
@@ -3057,7 +3684,7 @@
               <w:rPr>
                 <w:sz w:val="19"/>
               </w:rPr>
-              <w:t>（送信出力、0.1 W ずつ）</w:t>
+              <w:t>（送信出力、0.1 W ずつ。最大 15 W）</w:t>
             </w:r>
           </w:p>
         </w:tc>
@@ -3085,7 +3712,7 @@
               <w:rPr>
                 <w:sz w:val="19"/>
               </w:rPr>
-              <w:t>RIT / XIT のオフセット ⇔ VFO B の周波数</w:t>
+              <w:t>RIT / XIT のオフセット ⇔ VFO B の周波数（VFO A と同じステップ）</w:t>
             </w:r>
           </w:p>
         </w:tc>
@@ -3127,7 +3754,36 @@
     <w:p/>
     <w:p>
       <w:r>
-        <w:t>つまみは、ドラッグして回す、マウスホイールを回す、右半分をクリックで 1 目盛り上、左半分をクリックで 1 目盛り下、で操作します。</w:t>
+        <w:t>つまみは、次のどれでも操作できます。</w:t>
+      </w:r>
+    </w:p>
+    <w:p>
+      <w:pPr>
+        <w:pStyle w:val="ListBullet"/>
+      </w:pPr>
+      <w:r>
+        <w:t>ドラッグして回す</w:t>
+      </w:r>
+    </w:p>
+    <w:p>
+      <w:pPr>
+        <w:pStyle w:val="ListBullet"/>
+      </w:pPr>
+      <w:r>
+        <w:t>マウスホイールを回す</w:t>
+      </w:r>
+    </w:p>
+    <w:p>
+      <w:pPr>
+        <w:pStyle w:val="ListBullet"/>
+      </w:pPr>
+      <w:r>
+        <w:t>右半分をクリックで 1 目盛り上、左半分をクリックで 1 目盛り下</w:t>
+      </w:r>
+    </w:p>
+    <w:p>
+      <w:r>
+        <w:t>OFS / B つまみでオフセットを変えるときは、1 目盛りで本体の RIT のステップ 1 つ分（本体の RATE の設定によって 1〜50 Hz）変わります。</w:t>
       </w:r>
     </w:p>
     <w:p>
@@ -3135,7 +3791,7 @@
         <w:pStyle w:val="Heading2"/>
       </w:pPr>
       <w:r>
-        <w:t>5.3 周波数を変える</w:t>
+        <w:t>5.4 周波数を変える</w:t>
       </w:r>
     </w:p>
     <w:tbl>
@@ -3330,6 +3986,360 @@
           </w:p>
         </w:tc>
       </w:tr>
+      <w:tr>
+        <w:tc>
+          <w:tcPr>
+            <w:tcW w:type="dxa" w:w="4819"/>
+          </w:tcPr>
+          <w:p>
+            <w:r>
+              <w:rPr>
+                <w:sz w:val="19"/>
+              </w:rPr>
+              <w:t>OFS / B つまみ</w:t>
+            </w:r>
+          </w:p>
+        </w:tc>
+        <w:tc>
+          <w:tcPr>
+            <w:tcW w:type="dxa" w:w="4819"/>
+          </w:tcPr>
+          <w:p>
+            <w:r>
+              <w:rPr>
+                <w:sz w:val="19"/>
+              </w:rPr>
+              <w:t>VFO B の機能にすると、VFO B の周波数を変えられます</w:t>
+            </w:r>
+          </w:p>
+        </w:tc>
+      </w:tr>
+    </w:tbl>
+    <w:p/>
+    <w:p>
+      <w:r>
+        <w:t>周波数を直接入力するときは、</w:t>
+      </w:r>
+      <w:r>
+        <w:rPr>
+          <w:rFonts w:ascii="Menlo" w:hAnsi="Menlo"/>
+          <w:sz w:val="18"/>
+        </w:rPr>
+        <w:t>周波数入力</w:t>
+      </w:r>
+      <w:r>
+        <w:t xml:space="preserve"> 欄を使ってください。</w:t>
+      </w:r>
+      <w:r>
+        <w:rPr>
+          <w:rFonts w:ascii="Menlo" w:hAnsi="Menlo"/>
+          <w:sz w:val="18"/>
+        </w:rPr>
+        <w:t>FREQ ENT</w:t>
+      </w:r>
+      <w:r>
+        <w:t xml:space="preserve"> のキーパッド入力のうち、</w:t>
+      </w:r>
+      <w:r>
+        <w:rPr>
+          <w:rFonts w:ascii="Menlo" w:hAnsi="Menlo"/>
+          <w:sz w:val="18"/>
+        </w:rPr>
+        <w:t>7</w:t>
+      </w:r>
+      <w:r>
+        <w:t xml:space="preserve"> </w:t>
+      </w:r>
+      <w:r>
+        <w:rPr>
+          <w:rFonts w:ascii="Menlo" w:hAnsi="Menlo"/>
+          <w:sz w:val="18"/>
+        </w:rPr>
+        <w:t>8</w:t>
+      </w:r>
+      <w:r>
+        <w:t xml:space="preserve"> </w:t>
+      </w:r>
+      <w:r>
+        <w:rPr>
+          <w:rFonts w:ascii="Menlo" w:hAnsi="Menlo"/>
+          <w:sz w:val="18"/>
+        </w:rPr>
+        <w:t>9</w:t>
+      </w:r>
+      <w:r>
+        <w:t xml:space="preserve">（つまみの押しボタン）と </w:t>
+      </w:r>
+      <w:r>
+        <w:rPr>
+          <w:rFonts w:ascii="Menlo" w:hAnsi="Menlo"/>
+          <w:sz w:val="18"/>
+        </w:rPr>
+        <w:t>0</w:t>
+      </w:r>
+      <w:r>
+        <w:t>（</w:t>
+      </w:r>
+      <w:r>
+        <w:rPr>
+          <w:rFonts w:ascii="Menlo" w:hAnsi="Menlo"/>
+          <w:sz w:val="18"/>
+        </w:rPr>
+        <w:t>XMIT</w:t>
+      </w:r>
+      <w:r>
+        <w:t xml:space="preserve">）は、KX3 画面からは数字として送れません。特に </w:t>
+      </w:r>
+      <w:r>
+        <w:rPr>
+          <w:rFonts w:ascii="Menlo" w:hAnsi="Menlo"/>
+          <w:sz w:val="18"/>
+        </w:rPr>
+        <w:t>XMIT</w:t>
+      </w:r>
+      <w:r>
+        <w:t xml:space="preserve"> は送信になるので、キーパッド入力中に押さないでください。</w:t>
+      </w:r>
+    </w:p>
+    <w:p>
+      <w:pPr>
+        <w:pStyle w:val="Heading2"/>
+      </w:pPr>
+      <w:r>
+        <w:t>5.5 モードを変える</w:t>
+      </w:r>
+    </w:p>
+    <w:p>
+      <w:r>
+        <w:rPr>
+          <w:rFonts w:ascii="Menlo" w:hAnsi="Menlo"/>
+          <w:sz w:val="18"/>
+        </w:rPr>
+        <w:t>MODE</w:t>
+      </w:r>
+      <w:r>
+        <w:t xml:space="preserve"> を短く押すたびに、本体のモードが切り替わります（本体の </w:t>
+      </w:r>
+      <w:r>
+        <w:rPr>
+          <w:rFonts w:ascii="Menlo" w:hAnsi="Menlo"/>
+          <w:sz w:val="18"/>
+        </w:rPr>
+        <w:t>MODE</w:t>
+      </w:r>
+      <w:r>
+        <w:t xml:space="preserve"> キーと同じ順番です）。</w:t>
+      </w:r>
+      <w:r>
+        <w:rPr>
+          <w:rFonts w:ascii="Menlo" w:hAnsi="Menlo"/>
+          <w:sz w:val="18"/>
+        </w:rPr>
+        <w:t>MODE</w:t>
+      </w:r>
+      <w:r>
+        <w:t xml:space="preserve"> の長押し（</w:t>
+      </w:r>
+      <w:r>
+        <w:rPr>
+          <w:rFonts w:ascii="Menlo" w:hAnsi="Menlo"/>
+          <w:sz w:val="18"/>
+        </w:rPr>
+        <w:t>ALT</w:t>
+      </w:r>
+      <w:r>
+        <w:t>）で、LSB ⇔ USB、CW ⇔ CW-R、DATA ⇔ DATA-R などを切り替えます。</w:t>
+      </w:r>
+    </w:p>
+    <w:p>
+      <w:r>
+        <w:rPr>
+          <w:rFonts w:ascii="Menlo" w:hAnsi="Menlo"/>
+          <w:sz w:val="18"/>
+        </w:rPr>
+        <w:t>DATA</w:t>
+      </w:r>
+      <w:r>
+        <w:t xml:space="preserve"> を短く押すと DATA モードになります。サブモード（DATA A / AFSK A / FSK D / PSK D）は、本体の操作で選びます（本体の </w:t>
+      </w:r>
+      <w:r>
+        <w:rPr>
+          <w:rFonts w:ascii="Menlo" w:hAnsi="Menlo"/>
+          <w:sz w:val="18"/>
+        </w:rPr>
+        <w:t>DATA</w:t>
+      </w:r>
+      <w:r>
+        <w:t xml:space="preserve"> をもう一度押し、本体の OFS / VFO B つまみを回します）。KX3 画面の OFS / B つまみは VFO B やオフセットを変えるつまみなので、サブモードの選択には使えません。今のサブモードは LCD のモードの下に表示されます。</w:t>
+      </w:r>
+    </w:p>
+    <w:p>
+      <w:pPr>
+        <w:pStyle w:val="Heading2"/>
+      </w:pPr>
+      <w:r>
+        <w:t>5.6 VFO A / B とスプリット</w:t>
+      </w:r>
+    </w:p>
+    <w:tbl>
+      <w:tblPr>
+        <w:tblStyle w:val="TableGrid"/>
+        <w:tblW w:type="auto" w:w="0"/>
+        <w:tblLook w:firstColumn="1" w:firstRow="1" w:lastColumn="0" w:lastRow="0" w:noHBand="0" w:noVBand="1" w:val="04A0"/>
+      </w:tblPr>
+      <w:tblGrid>
+        <w:gridCol w:w="4819"/>
+        <w:gridCol w:w="4819"/>
+      </w:tblGrid>
+      <w:tr>
+        <w:tc>
+          <w:tcPr>
+            <w:tcW w:type="dxa" w:w="4819"/>
+          </w:tcPr>
+          <w:p>
+            <w:r>
+              <w:rPr>
+                <w:b/>
+                <w:sz w:val="19"/>
+              </w:rPr>
+              <w:t>操作</w:t>
+            </w:r>
+          </w:p>
+        </w:tc>
+        <w:tc>
+          <w:tcPr>
+            <w:tcW w:type="dxa" w:w="4819"/>
+          </w:tcPr>
+          <w:p>
+            <w:r>
+              <w:rPr>
+                <w:b/>
+                <w:sz w:val="19"/>
+              </w:rPr>
+              <w:t>内容</w:t>
+            </w:r>
+          </w:p>
+        </w:tc>
+      </w:tr>
+      <w:tr>
+        <w:tc>
+          <w:tcPr>
+            <w:tcW w:type="dxa" w:w="4819"/>
+          </w:tcPr>
+          <w:p>
+            <w:r>
+              <w:rPr>
+                <w:rFonts w:ascii="Menlo" w:hAnsi="Menlo"/>
+                <w:sz w:val="19"/>
+              </w:rPr>
+              <w:t>A / B</w:t>
+            </w:r>
+          </w:p>
+        </w:tc>
+        <w:tc>
+          <w:tcPr>
+            <w:tcW w:type="dxa" w:w="4819"/>
+          </w:tcPr>
+          <w:p>
+            <w:r>
+              <w:rPr>
+                <w:sz w:val="19"/>
+              </w:rPr>
+              <w:t>VFO A と VFO B の周波数を入れ替えます</w:t>
+            </w:r>
+          </w:p>
+        </w:tc>
+      </w:tr>
+      <w:tr>
+        <w:tc>
+          <w:tcPr>
+            <w:tcW w:type="dxa" w:w="4819"/>
+          </w:tcPr>
+          <w:p>
+            <w:r>
+              <w:rPr>
+                <w:rFonts w:ascii="Menlo" w:hAnsi="Menlo"/>
+                <w:sz w:val="19"/>
+              </w:rPr>
+              <w:t>A → B</w:t>
+            </w:r>
+          </w:p>
+        </w:tc>
+        <w:tc>
+          <w:tcPr>
+            <w:tcW w:type="dxa" w:w="4819"/>
+          </w:tcPr>
+          <w:p>
+            <w:r>
+              <w:rPr>
+                <w:sz w:val="19"/>
+              </w:rPr>
+              <w:t>VFO A の周波数を VFO B にコピーします</w:t>
+            </w:r>
+          </w:p>
+        </w:tc>
+      </w:tr>
+      <w:tr>
+        <w:tc>
+          <w:tcPr>
+            <w:tcW w:type="dxa" w:w="4819"/>
+          </w:tcPr>
+          <w:p>
+            <w:r>
+              <w:rPr>
+                <w:rFonts w:ascii="Menlo" w:hAnsi="Menlo"/>
+                <w:sz w:val="19"/>
+              </w:rPr>
+              <w:t>A → B</w:t>
+            </w:r>
+            <w:r>
+              <w:rPr>
+                <w:sz w:val="19"/>
+              </w:rPr>
+              <w:t xml:space="preserve"> の長押し（</w:t>
+            </w:r>
+            <w:r>
+              <w:rPr>
+                <w:rFonts w:ascii="Menlo" w:hAnsi="Menlo"/>
+                <w:sz w:val="19"/>
+              </w:rPr>
+              <w:t>SPLIT</w:t>
+            </w:r>
+            <w:r>
+              <w:rPr>
+                <w:sz w:val="19"/>
+              </w:rPr>
+              <w:t>）</w:t>
+            </w:r>
+          </w:p>
+        </w:tc>
+        <w:tc>
+          <w:tcPr>
+            <w:tcW w:type="dxa" w:w="4819"/>
+          </w:tcPr>
+          <w:p>
+            <w:r>
+              <w:rPr>
+                <w:sz w:val="19"/>
+              </w:rPr>
+              <w:t xml:space="preserve">スプリット ON / OFF。ON のときは VFO A で受信、VFO B で送信します（LCD に </w:t>
+            </w:r>
+            <w:r>
+              <w:rPr>
+                <w:rFonts w:ascii="Menlo" w:hAnsi="Menlo"/>
+                <w:sz w:val="19"/>
+              </w:rPr>
+              <w:t>SPLT</w:t>
+            </w:r>
+            <w:r>
+              <w:rPr>
+                <w:sz w:val="19"/>
+              </w:rPr>
+              <w:t>）</w:t>
+            </w:r>
+          </w:p>
+        </w:tc>
+      </w:tr>
     </w:tbl>
     <w:p/>
     <w:p>
@@ -3337,7 +4347,124 @@
         <w:pStyle w:val="Heading2"/>
       </w:pPr>
       <w:r>
-        <w:t>5.4 送信する</w:t>
+        <w:t>5.7 RIT / XIT</w:t>
+      </w:r>
+    </w:p>
+    <w:p>
+      <w:pPr>
+        <w:pStyle w:val="ListNumber"/>
+      </w:pPr>
+      <w:r>
+        <w:rPr>
+          <w:rFonts w:ascii="Menlo" w:hAnsi="Menlo"/>
+          <w:sz w:val="18"/>
+        </w:rPr>
+        <w:t>RIT</w:t>
+      </w:r>
+      <w:r>
+        <w:t xml:space="preserve">（または </w:t>
+      </w:r>
+      <w:r>
+        <w:rPr>
+          <w:rFonts w:ascii="Menlo" w:hAnsi="Menlo"/>
+          <w:sz w:val="18"/>
+        </w:rPr>
+        <w:t>XIT</w:t>
+      </w:r>
+      <w:r>
+        <w:t xml:space="preserve">）を短く押すと ON になり、LCD に </w:t>
+      </w:r>
+      <w:r>
+        <w:rPr>
+          <w:rFonts w:ascii="Menlo" w:hAnsi="Menlo"/>
+          <w:sz w:val="18"/>
+        </w:rPr>
+        <w:t>RIT</w:t>
+      </w:r>
+      <w:r>
+        <w:t>（</w:t>
+      </w:r>
+      <w:r>
+        <w:rPr>
+          <w:rFonts w:ascii="Menlo" w:hAnsi="Menlo"/>
+          <w:sz w:val="18"/>
+        </w:rPr>
+        <w:t>XIT</w:t>
+      </w:r>
+      <w:r>
+        <w:t>）が点灯して、オフセットが表示されます。</w:t>
+      </w:r>
+    </w:p>
+    <w:p>
+      <w:pPr>
+        <w:pStyle w:val="ListNumber"/>
+      </w:pPr>
+      <w:r>
+        <w:t xml:space="preserve">OFS / B つまみがオフセットの機能（緑色の文字が </w:t>
+      </w:r>
+      <w:r>
+        <w:rPr>
+          <w:rFonts w:ascii="Menlo" w:hAnsi="Menlo"/>
+          <w:sz w:val="18"/>
+        </w:rPr>
+        <w:t>OFS</w:t>
+      </w:r>
+      <w:r>
+        <w:t>）になっていることを確認して、つまみを回します。</w:t>
+      </w:r>
+    </w:p>
+    <w:p>
+      <w:pPr>
+        <w:pStyle w:val="ListNumber"/>
+      </w:pPr>
+      <w:r>
+        <w:t>OFS / B の押しボタンの長押し（</w:t>
+      </w:r>
+      <w:r>
+        <w:rPr>
+          <w:rFonts w:ascii="Menlo" w:hAnsi="Menlo"/>
+          <w:sz w:val="18"/>
+        </w:rPr>
+        <w:t>CLR</w:t>
+      </w:r>
+      <w:r>
+        <w:t>）で、オフセットを 0 に戻します。</w:t>
+      </w:r>
+    </w:p>
+    <w:p>
+      <w:pPr>
+        <w:pStyle w:val="ListNumber"/>
+      </w:pPr>
+      <w:r>
+        <w:t xml:space="preserve">もう一度 </w:t>
+      </w:r>
+      <w:r>
+        <w:rPr>
+          <w:rFonts w:ascii="Menlo" w:hAnsi="Menlo"/>
+          <w:sz w:val="18"/>
+        </w:rPr>
+        <w:t>RIT</w:t>
+      </w:r>
+      <w:r>
+        <w:t>（</w:t>
+      </w:r>
+      <w:r>
+        <w:rPr>
+          <w:rFonts w:ascii="Menlo" w:hAnsi="Menlo"/>
+          <w:sz w:val="18"/>
+        </w:rPr>
+        <w:t>XIT</w:t>
+      </w:r>
+      <w:r>
+        <w:t>）を押すと OFF になります。</w:t>
+      </w:r>
+    </w:p>
+    <w:p>
+      <w:pPr>
+        <w:pStyle w:val="Heading2"/>
+      </w:pPr>
+      <w:r>
+        <w:t>5.8 送信する</w:t>
       </w:r>
     </w:p>
     <w:p>
@@ -3387,6 +4514,89 @@
     </w:p>
     <w:p>
       <w:pPr>
+        <w:jc w:val="center"/>
+      </w:pPr>
+      <w:r>
+        <w:drawing>
+          <wp:inline xmlns:a="http://schemas.openxmlformats.org/drawingml/2006/main" xmlns:pic="http://schemas.openxmlformats.org/drawingml/2006/picture">
+            <wp:extent cx="6120000" cy="3300975"/>
+            <wp:docPr id="4" name="Picture 4"/>
+            <wp:cNvGraphicFramePr>
+              <a:graphicFrameLocks noChangeAspect="1"/>
+            </wp:cNvGraphicFramePr>
+            <a:graphic>
+              <a:graphicData uri="http://schemas.openxmlformats.org/drawingml/2006/picture">
+                <pic:pic>
+                  <pic:nvPicPr>
+                    <pic:cNvPr id="0" name="kx3-tx-example.png"/>
+                    <pic:cNvPicPr/>
+                  </pic:nvPicPr>
+                  <pic:blipFill>
+                    <a:blip r:embed="rId15"/>
+                    <a:stretch>
+                      <a:fillRect/>
+                    </a:stretch>
+                  </pic:blipFill>
+                  <pic:spPr>
+                    <a:xfrm>
+                      <a:off x="0" y="0"/>
+                      <a:ext cx="6120000" cy="3300975"/>
+                    </a:xfrm>
+                    <a:prstGeom prst="rect"/>
+                  </pic:spPr>
+                </pic:pic>
+              </a:graphicData>
+            </a:graphic>
+          </wp:inline>
+        </w:drawing>
+      </w:r>
+    </w:p>
+    <w:p>
+      <w:pPr>
+        <w:jc w:val="center"/>
+      </w:pPr>
+      <w:r>
+        <w:rPr>
+          <w:sz w:val="18"/>
+        </w:rPr>
+        <w:t>送信中の表示例（RIT ON、CW モード）</w:t>
+      </w:r>
+    </w:p>
+    <w:p>
+      <w:r>
+        <w:t>（この画像は、送信中の表示を説明するための例で、実機の代わりに試験用のプログラムをつないで撮影しました。）</w:t>
+      </w:r>
+    </w:p>
+    <w:p>
+      <w:pPr>
+        <w:pStyle w:val="ListBullet"/>
+      </w:pPr>
+      <w:r>
+        <w:t>送信中は、LCD 最上段のバーが送信出力（</w:t>
+      </w:r>
+      <w:r>
+        <w:rPr>
+          <w:rFonts w:ascii="Menlo" w:hAnsi="Menlo"/>
+          <w:sz w:val="18"/>
+        </w:rPr>
+        <w:t>PWR</w:t>
+      </w:r>
+      <w:r>
+        <w:t>）の表示になり、</w:t>
+      </w:r>
+      <w:r>
+        <w:rPr>
+          <w:rFonts w:ascii="Menlo" w:hAnsi="Menlo"/>
+          <w:sz w:val="18"/>
+        </w:rPr>
+        <w:t>TX</w:t>
+      </w:r>
+      <w:r>
+        <w:t xml:space="preserve"> が点灯します。</w:t>
+      </w:r>
+    </w:p>
+    <w:p>
+      <w:pPr>
         <w:pStyle w:val="ListBullet"/>
       </w:pPr>
       <w:r>
@@ -3426,12 +4636,23 @@
         <w:pStyle w:val="Heading2"/>
       </w:pPr>
       <w:r>
-        <w:t>5.5 CW の文字送信</w:t>
+        <w:t>5.9 CW の文字送信</w:t>
       </w:r>
     </w:p>
     <w:p>
+      <w:pPr>
+        <w:pStyle w:val="ListNumber"/>
+      </w:pPr>
       <w:r>
-        <w:t xml:space="preserve">モードを CW（または CW-R）にして、最下段の </w:t>
+        <w:t>モードを CW（または CW-R）にします。</w:t>
+      </w:r>
+    </w:p>
+    <w:p>
+      <w:pPr>
+        <w:pStyle w:val="ListNumber"/>
+      </w:pPr>
+      <w:r>
+        <w:t xml:space="preserve">最下段の </w:t>
       </w:r>
       <w:r>
         <w:rPr>
@@ -3441,7 +4662,15 @@
         <w:t>CW送信</w:t>
       </w:r>
       <w:r>
-        <w:t xml:space="preserve"> 欄に文字を入力し、Enter を押すと、本体のキーヤーで送信します。使える文字は英字・数字・空白と </w:t>
+        <w:t xml:space="preserve"> 欄に文字を入力して Enter を押すと、本体のキーヤーで送信します。</w:t>
+      </w:r>
+    </w:p>
+    <w:p>
+      <w:pPr>
+        <w:pStyle w:val="ListBullet"/>
+      </w:pPr>
+      <w:r>
+        <w:t xml:space="preserve">使える文字は、英字・数字・空白と </w:t>
       </w:r>
       <w:r>
         <w:rPr>
@@ -3451,7 +4680,23 @@
         <w:t>/ ? . , = + -</w:t>
       </w:r>
       <w:r>
-        <w:t xml:space="preserve"> です。英小文字は大文字にして送ります。</w:t>
+        <w:t xml:space="preserve"> です。英小文字は大文字にして送ります。それ以外の文字は送りません。</w:t>
+      </w:r>
+    </w:p>
+    <w:p>
+      <w:pPr>
+        <w:pStyle w:val="ListBullet"/>
+      </w:pPr>
+      <w:r>
+        <w:t>送信速度は、KEYER / MIC つまみ（CW のとき WPM）で設定したキーヤー速度です。</w:t>
+      </w:r>
+    </w:p>
+    <w:p>
+      <w:pPr>
+        <w:pStyle w:val="ListBullet"/>
+      </w:pPr>
+      <w:r>
+        <w:t>CW 以外のモードで Enter を押すと、「CW 送信は CW / CW-R モードで使用してください。」と表示され、送信しません。</w:t>
       </w:r>
     </w:p>
     <w:p>
@@ -3459,7 +4704,7 @@
         <w:pStyle w:val="Heading2"/>
       </w:pPr>
       <w:r>
-        <w:t>5.6 電源 OFF</w:t>
+        <w:t>5.10 電源 OFF</w:t>
       </w:r>
     </w:p>
     <w:p>
@@ -3471,8 +4716,13 @@
         <w:t>電源 OFF</w:t>
       </w:r>
       <w:r>
-        <w:t xml:space="preserve"> を押すと「無線機の電源を OFF にして、プログラムを終了しますか？」と確認が出ます。</w:t>
+        <w:t xml:space="preserve"> を押すと「無線機の電源を OFF にして、プログラムを終了しますか？（電源 ON は本体の操作が必要です）」と確認が出ます。</w:t>
       </w:r>
+    </w:p>
+    <w:p>
+      <w:pPr>
+        <w:pStyle w:val="ListBullet"/>
+      </w:pPr>
       <w:r>
         <w:rPr>
           <w:rFonts w:ascii="Menlo" w:hAnsi="Menlo"/>
@@ -3481,7 +4731,15 @@
         <w:t>はい</w:t>
       </w:r>
       <w:r>
-        <w:t xml:space="preserve"> を押すと、無線機の電源を切ってから wfview-mac も終了します。電源を入れるときは、本体の電源スイッチを使ってください。</w:t>
+        <w:t xml:space="preserve"> を押すと、無線機の電源を切ってから wfview-mac も終了します。設定を保存していない場合は、終了前に保存するかどうか聞かれます。</w:t>
+      </w:r>
+    </w:p>
+    <w:p>
+      <w:pPr>
+        <w:pStyle w:val="ListBullet"/>
+      </w:pPr>
+      <w:r>
+        <w:t>電源を入れるときは、本体の電源スイッチを使ってください（CAT では電源を入れられません）。</w:t>
       </w:r>
     </w:p>
     <w:p>
@@ -3489,7 +4747,7 @@
         <w:pStyle w:val="Heading2"/>
       </w:pPr>
       <w:r>
-        <w:t>5.7 表示を更新する</w:t>
+        <w:t>5.11 表示を更新する</w:t>
       </w:r>
     </w:p>
     <w:p>
@@ -3504,7 +4762,42 @@
         <w:t>更新</w:t>
       </w:r>
       <w:r>
-        <w:t xml:space="preserve"> を押すと、本体の状態をすべて読み直して表示を合わせます（周波数・モード・S メーターなどは常に自動で読み直しています）。</w:t>
+        <w:t xml:space="preserve"> を押すと、本体の状態をすべて読み直して表示を合わせます。</w:t>
+      </w:r>
+    </w:p>
+    <w:p>
+      <w:r>
+        <w:t>周波数・モード・S メーター・送信状態は常に自動で読み直しています。その他の設定（AF / RF ゲイン、出力、帯域幅など）も、数秒ごとに順番に読み直しています。</w:t>
+      </w:r>
+    </w:p>
+    <w:p>
+      <w:pPr>
+        <w:pStyle w:val="Heading2"/>
+      </w:pPr>
+      <w:r>
+        <w:t>5.12 本体のメニュー</w:t>
+      </w:r>
+    </w:p>
+    <w:p>
+      <w:r>
+        <w:rPr>
+          <w:rFonts w:ascii="Menlo" w:hAnsi="Menlo"/>
+          <w:sz w:val="18"/>
+        </w:rPr>
+        <w:t>DISP</w:t>
+      </w:r>
+      <w:r>
+        <w:t xml:space="preserve"> の長押し（</w:t>
+      </w:r>
+      <w:r>
+        <w:rPr>
+          <w:rFonts w:ascii="Menlo" w:hAnsi="Menlo"/>
+          <w:sz w:val="18"/>
+        </w:rPr>
+        <w:t>MENU</w:t>
+      </w:r>
+      <w:r>
+        <w:t>）で本体のメニューに入れますが、メニューの項目と値は KX3 画面の LCD には表示されません。メニューの操作は、本体の表示を見ながら本体のつまみで行ってください。</w:t>
       </w:r>
     </w:p>
     <w:p>
@@ -3517,7 +4810,33 @@
     </w:p>
     <w:p>
       <w:r>
-        <w:t xml:space="preserve">KX2 を接続した場合は、自動で KX2 と判別し、画面の表示が KX2 になります。周波数・モード・つまみ・送信などは KX3 と同じように使えますが、前面パネルのキー（22 個のキーと、つまみの押しボタンの </w:t>
+        <w:t xml:space="preserve">KX2 を接続した場合は、自動で KX2 と判別し、画面の表示が </w:t>
+      </w:r>
+      <w:r>
+        <w:rPr>
+          <w:rFonts w:ascii="Menlo" w:hAnsi="Menlo"/>
+          <w:sz w:val="18"/>
+        </w:rPr>
+        <w:t>KX2</w:t>
+      </w:r>
+      <w:r>
+        <w:t xml:space="preserve"> になります。</w:t>
+      </w:r>
+    </w:p>
+    <w:p>
+      <w:pPr>
+        <w:pStyle w:val="ListBullet"/>
+      </w:pPr>
+      <w:r>
+        <w:t>周波数、つまみ（AF / RF / スケルチ、帯域幅 / シフト、マイク / キーヤー速度 / 出力、オフセット / VFO B）、送信、CW 文字送信、電源 OFF は、KX3 と同じように使えます。送信出力の上限は 12 W です。</w:t>
+      </w:r>
+    </w:p>
+    <w:p>
+      <w:pPr>
+        <w:pStyle w:val="ListBullet"/>
+      </w:pPr>
+      <w:r>
+        <w:t xml:space="preserve">前面パネルのキー（22 個のキーと、AF / RF-SQL の押しボタンの長押し </w:t>
       </w:r>
       <w:r>
         <w:rPr>
@@ -3527,7 +4846,7 @@
         <w:t>MON</w:t>
       </w:r>
       <w:r>
-        <w:t>）は KX2 では使えません（KX2 は本体のキーの配置とコマンドが違うため）。</w:t>
+        <w:t>）は、KX2 では使えません。KX2 は本体のキーの配置と命令が KX3 と違うためです。押すと記録に「KX2 ではこのキーは未対応です」と書かれ、何もしません。</w:t>
       </w:r>
     </w:p>
     <w:p>
@@ -3586,10 +4905,51 @@
     </w:p>
     <w:p>
       <w:pPr>
+        <w:pStyle w:val="ListBullet"/>
+      </w:pPr>
+      <w:r>
+        <w:t>終了するときは「プログラムを終了しますか？」と確認が出ます。設定を保存していないときは「設定が保存されていません。このまま終了しますか？」と出るので、</w:t>
+      </w:r>
+      <w:r>
+        <w:rPr>
+          <w:rFonts w:ascii="Menlo" w:hAnsi="Menlo"/>
+          <w:sz w:val="18"/>
+        </w:rPr>
+        <w:t>保存</w:t>
+      </w:r>
+      <w:r>
+        <w:t xml:space="preserve"> を押すと保存してから終了します。</w:t>
+      </w:r>
+    </w:p>
+    <w:p>
+      <w:pPr>
         <w:pStyle w:val="Heading1"/>
       </w:pPr>
       <w:r>
-        <w:t>8. トラブルシューティング</w:t>
+        <w:t>8. 他のソフトと併用するとき</w:t>
+      </w:r>
+    </w:p>
+    <w:p>
+      <w:r>
+        <w:t xml:space="preserve">KX3 のシリアルポートは、同時に 1 つのソフトしか使えません。QSOLogMac、KX3 Utility、その他の CAT ソフトがポートを使っているときは、それを終了してから </w:t>
+      </w:r>
+      <w:r>
+        <w:rPr>
+          <w:rFonts w:ascii="Menlo" w:hAnsi="Menlo"/>
+          <w:sz w:val="18"/>
+        </w:rPr>
+        <w:t>無線機に接続</w:t>
+      </w:r>
+      <w:r>
+        <w:t xml:space="preserve"> を押してください。</w:t>
+      </w:r>
+    </w:p>
+    <w:p>
+      <w:pPr>
+        <w:pStyle w:val="Heading1"/>
+      </w:pPr>
+      <w:r>
+        <w:t>9. トラブルシューティング</w:t>
       </w:r>
     </w:p>
     <w:tbl>
@@ -3668,7 +5028,7 @@
               <w:rPr>
                 <w:sz w:val="19"/>
               </w:rPr>
-              <w:t>wfview-mac を最新版に更新してください</w:t>
+              <w:t>wfview-mac を 2026.10.22.1 以降に更新してください</w:t>
             </w:r>
           </w:p>
         </w:tc>
@@ -3709,7 +5069,7 @@
               <w:rPr>
                 <w:sz w:val="19"/>
               </w:rPr>
-              <w:t>）。ドライバ機能拡張が ON になっているか確認し、ケーブルを挿し直します</w:t>
+              <w:t>）。ドライバ機能拡張が ON になっているか確認し、ケーブルを挿し直します。別の USB 端子やハブも試します</w:t>
             </w:r>
           </w:p>
         </w:tc>
@@ -3737,7 +5097,20 @@
               <w:rPr>
                 <w:sz w:val="19"/>
               </w:rPr>
-              <w:t>シリアルポートの選択を確認します。他のアプリ（QSOLogMac、KX3 Utility など）がそのポートを使っていないか確認します</w:t>
+              <w:t>シリアルポートの選択を確認します。他のアプリがそのポートを使っていないか確認します（</w:t>
+            </w:r>
+            <w:r>
+              <w:rPr>
+                <w:color w:val="0645AD"/>
+                <w:sz w:val="19"/>
+              </w:rPr>
+              <w:t>8</w:t>
+            </w:r>
+            <w:r>
+              <w:rPr>
+                <w:sz w:val="19"/>
+              </w:rPr>
+              <w:t>）</w:t>
             </w:r>
           </w:p>
         </w:tc>
@@ -3793,7 +5166,7 @@
               <w:rPr>
                 <w:sz w:val="19"/>
               </w:rPr>
-              <w:t>本体の VFO ロック（</w:t>
+              <w:t xml:space="preserve">本体の VFO ロック（LCD の </w:t>
             </w:r>
             <w:r>
               <w:rPr>
@@ -3834,20 +5207,35 @@
               <w:rPr>
                 <w:sz w:val="19"/>
               </w:rPr>
-              <w:t>本体がメニュー表示中などで、そのキーを受け付けない状態のことがあります。</w:t>
-            </w:r>
-            <w:r>
-              <w:rPr>
-                <w:rFonts w:ascii="Menlo" w:hAnsi="Menlo"/>
-                <w:sz w:val="19"/>
-              </w:rPr>
-              <w:t>DISP</w:t>
-            </w:r>
-            <w:r>
-              <w:rPr>
-                <w:sz w:val="19"/>
-              </w:rPr>
-              <w:t xml:space="preserve"> などで通常の表示に戻してから押します</w:t>
+              <w:t>本体がメニュー表示中などで、そのキーを受け付けない状態のことがあります。本体の表示を確認し、通常の表示に戻してから押します</w:t>
+            </w:r>
+          </w:p>
+        </w:tc>
+      </w:tr>
+      <w:tr>
+        <w:tc>
+          <w:tcPr>
+            <w:tcW w:type="dxa" w:w="4819"/>
+          </w:tcPr>
+          <w:p>
+            <w:r>
+              <w:rPr>
+                <w:sz w:val="19"/>
+              </w:rPr>
+              <w:t>つまみを回しても値が変わらない</w:t>
+            </w:r>
+          </w:p>
+        </w:tc>
+        <w:tc>
+          <w:tcPr>
+            <w:tcW w:type="dxa" w:w="4819"/>
+          </w:tcPr>
+          <w:p>
+            <w:r>
+              <w:rPr>
+                <w:sz w:val="19"/>
+              </w:rPr>
+              <w:t>つまみの下の緑色の文字で、今の機能を確認します。押しボタンを短く押すと機能が切り替わります</w:t>
             </w:r>
           </w:p>
         </w:tc>
@@ -3884,7 +5272,7 @@
         <w:pStyle w:val="Heading1"/>
       </w:pPr>
       <w:r>
-        <w:t>9. 安全上の注意</w:t>
+        <w:t>10. 安全上の注意</w:t>
       </w:r>
     </w:p>
     <w:p>
@@ -4372,8 +5760,8 @@
       <w:rFonts w:asciiTheme="majorHAnsi" w:eastAsiaTheme="majorEastAsia" w:hAnsiTheme="majorHAnsi" w:cstheme="majorBidi" w:ascii="Helvetica Neue" w:hAnsi="Helvetica Neue" w:eastAsia="Hiragino Sans"/>
       <w:b/>
       <w:bCs/>
-      <w:color w:val="365F91" w:themeColor="accent1" w:themeShade="BF"/>
-      <w:sz w:val="28"/>
+      <w:color w:val="1F4E79"/>
+      <w:sz w:val="32"/>
       <w:szCs w:val="28"/>
     </w:rPr>
   </w:style>
@@ -4396,7 +5784,7 @@
       <w:rFonts w:asciiTheme="majorHAnsi" w:eastAsiaTheme="majorEastAsia" w:hAnsiTheme="majorHAnsi" w:cstheme="majorBidi" w:ascii="Helvetica Neue" w:hAnsi="Helvetica Neue" w:eastAsia="Hiragino Sans"/>
       <w:b/>
       <w:bCs/>
-      <w:color w:val="4F81BD" w:themeColor="accent1"/>
+      <w:color w:val="1F4E79"/>
       <w:sz w:val="26"/>
       <w:szCs w:val="26"/>
     </w:rPr>
@@ -4420,7 +5808,8 @@
       <w:rFonts w:asciiTheme="majorHAnsi" w:eastAsiaTheme="majorEastAsia" w:hAnsiTheme="majorHAnsi" w:cstheme="majorBidi" w:ascii="Helvetica Neue" w:hAnsi="Helvetica Neue" w:eastAsia="Hiragino Sans"/>
       <w:b/>
       <w:bCs/>
-      <w:color w:val="4F81BD" w:themeColor="accent1"/>
+      <w:color w:val="1F4E79"/>
+      <w:sz w:val="23"/>
     </w:rPr>
   </w:style>
   <w:style w:type="paragraph" w:styleId="Heading4">
@@ -4659,10 +6048,10 @@
     </w:pPr>
     <w:rPr>
       <w:rFonts w:asciiTheme="majorHAnsi" w:eastAsiaTheme="majorEastAsia" w:hAnsiTheme="majorHAnsi" w:cstheme="majorBidi" w:ascii="Helvetica Neue" w:hAnsi="Helvetica Neue" w:eastAsia="Hiragino Sans"/>
-      <w:color w:val="17365D" w:themeColor="text2" w:themeShade="BF"/>
+      <w:color w:val="1F4E79"/>
       <w:spacing w:val="5"/>
       <w:kern w:val="28"/>
-      <w:sz w:val="52"/>
+      <w:sz w:val="40"/>
       <w:szCs w:val="52"/>
     </w:rPr>
   </w:style>
@@ -4838,9 +6227,6 @@
       </w:numPr>
       <w:contextualSpacing/>
     </w:pPr>
-    <w:rPr>
-      <w:rFonts w:ascii="Helvetica Neue" w:hAnsi="Helvetica Neue" w:eastAsia="Hiragino Sans"/>
-    </w:rPr>
   </w:style>
   <w:style w:type="paragraph" w:styleId="ListBullet2">
     <w:name w:val="List Bullet 2"/>
@@ -4880,9 +6266,6 @@
       </w:numPr>
       <w:contextualSpacing/>
     </w:pPr>
-    <w:rPr>
-      <w:rFonts w:ascii="Helvetica Neue" w:hAnsi="Helvetica Neue" w:eastAsia="Hiragino Sans"/>
-    </w:rPr>
   </w:style>
   <w:style w:type="paragraph" w:styleId="ListNumber2">
     <w:name w:val="List Number 2"/>

</xml_diff>